<commit_message>
keil dac_treiber geschreiben -6h
</commit_message>
<xml_diff>
--- a/Dokumentation/Diplomarbeit_Template.docx
+++ b/Dokumentation/Diplomarbeit_Template.docx
@@ -1,6 +1,6 @@
 
 <file path=word/document.xml><?xml version="1.0" encoding="utf-8"?>
-<w:document xmlns:wpc="http://schemas.microsoft.com/office/word/2010/wordprocessingCanvas" xmlns:cx="http://schemas.microsoft.com/office/drawing/2014/chartex" xmlns:cx1="http://schemas.microsoft.com/office/drawing/2015/9/8/chartex" xmlns:cx2="http://schemas.microsoft.com/office/drawing/2015/10/21/chartex" xmlns:cx3="http://schemas.microsoft.com/office/drawing/2016/5/9/chartex" xmlns:cx4="http://schemas.microsoft.com/office/drawing/2016/5/10/chartex" xmlns:cx5="http://schemas.microsoft.com/office/drawing/2016/5/11/chartex" xmlns:cx6="http://schemas.microsoft.com/office/drawing/2016/5/12/chartex" xmlns:cx7="http://schemas.microsoft.com/office/drawing/2016/5/13/chartex" xmlns:cx8="http://schemas.microsoft.com/office/drawing/2016/5/14/chartex" xmlns:mc="http://schemas.openxmlformats.org/markup-compatibility/2006" xmlns:aink="http://schemas.microsoft.com/office/drawing/2016/ink" xmlns:am3d="http://schemas.microsoft.com/office/drawing/2017/model3d" xmlns:o="urn:schemas-microsoft-com:office:office" xmlns:oel="http://schemas.microsoft.com/office/2019/extlst" xmlns:r="http://schemas.openxmlformats.org/officeDocument/2006/relationships" xmlns:m="http://schemas.openxmlformats.org/officeDocument/2006/math" xmlns:v="urn:schemas-microsoft-com:vml" xmlns:wp14="http://schemas.microsoft.com/office/word/2010/wordprocessingDrawing" xmlns:wp="http://schemas.openxmlformats.org/drawingml/2006/wordprocessingDrawing" xmlns:w10="urn:schemas-microsoft-com:office:word" xmlns:w="http://schemas.openxmlformats.org/wordprocessingml/2006/main" xmlns:w14="http://schemas.microsoft.com/office/word/2010/wordml" xmlns:w15="http://schemas.microsoft.com/office/word/2012/wordml" xmlns:w16cex="http://schemas.microsoft.com/office/word/2018/wordml/cex" xmlns:w16cid="http://schemas.microsoft.com/office/word/2016/wordml/cid" xmlns:w16="http://schemas.microsoft.com/office/word/2018/wordml" xmlns:w16du="http://schemas.microsoft.com/office/word/2023/wordml/word16du" xmlns:w16sdtdh="http://schemas.microsoft.com/office/word/2020/wordml/sdtdatahash" xmlns:w16sdtfl="http://schemas.microsoft.com/office/word/2024/wordml/sdtformatlock" xmlns:w16se="http://schemas.microsoft.com/office/word/2015/wordml/symex" xmlns:wpg="http://schemas.microsoft.com/office/word/2010/wordprocessingGroup" xmlns:wpi="http://schemas.microsoft.com/office/word/2010/wordprocessingInk" xmlns:wne="http://schemas.microsoft.com/office/word/2006/wordml" xmlns:wps="http://schemas.microsoft.com/office/word/2010/wordprocessingShape" mc:Ignorable="w14 w15 w16se w16cid w16 w16cex w16sdtdh w16sdtfl w16du wp14">
+<w:document xmlns:wpc="http://schemas.microsoft.com/office/word/2010/wordprocessingCanvas" xmlns:cx="http://schemas.microsoft.com/office/drawing/2014/chartex" xmlns:cx1="http://schemas.microsoft.com/office/drawing/2015/9/8/chartex" xmlns:cx2="http://schemas.microsoft.com/office/drawing/2015/10/21/chartex" xmlns:cx3="http://schemas.microsoft.com/office/drawing/2016/5/9/chartex" xmlns:cx4="http://schemas.microsoft.com/office/drawing/2016/5/10/chartex" xmlns:cx5="http://schemas.microsoft.com/office/drawing/2016/5/11/chartex" xmlns:cx6="http://schemas.microsoft.com/office/drawing/2016/5/12/chartex" xmlns:cx7="http://schemas.microsoft.com/office/drawing/2016/5/13/chartex" xmlns:cx8="http://schemas.microsoft.com/office/drawing/2016/5/14/chartex" xmlns:mc="http://schemas.openxmlformats.org/markup-compatibility/2006" xmlns:aink="http://schemas.microsoft.com/office/drawing/2016/ink" xmlns:am3d="http://schemas.microsoft.com/office/drawing/2017/model3d" xmlns:o="urn:schemas-microsoft-com:office:office" xmlns:oel="http://schemas.microsoft.com/office/2019/extlst" xmlns:r="http://schemas.openxmlformats.org/officeDocument/2006/relationships" xmlns:m="http://schemas.openxmlformats.org/officeDocument/2006/math" xmlns:v="urn:schemas-microsoft-com:vml" xmlns:wp14="http://schemas.microsoft.com/office/word/2010/wordprocessingDrawing" xmlns:wp="http://schemas.openxmlformats.org/drawingml/2006/wordprocessingDrawing" xmlns:w10="urn:schemas-microsoft-com:office:word" xmlns:w="http://schemas.openxmlformats.org/wordprocessingml/2006/main" xmlns:w14="http://schemas.microsoft.com/office/word/2010/wordml" xmlns:w15="http://schemas.microsoft.com/office/word/2012/wordml" xmlns:w16cei="http://schemas.microsoft.com/office/word/2026/wordml/cei" xmlns:w16cex="http://schemas.microsoft.com/office/word/2018/wordml/cex" xmlns:w16cid="http://schemas.microsoft.com/office/word/2016/wordml/cid" xmlns:w16="http://schemas.microsoft.com/office/word/2018/wordml" xmlns:w16du="http://schemas.microsoft.com/office/word/2023/wordml/word16du" xmlns:w16sdtdh="http://schemas.microsoft.com/office/word/2020/wordml/sdtdatahash" xmlns:w16sdtfl="http://schemas.microsoft.com/office/word/2024/wordml/sdtformatlock" xmlns:w16se="http://schemas.microsoft.com/office/word/2015/wordml/symex" xmlns:wpg="http://schemas.microsoft.com/office/word/2010/wordprocessingGroup" xmlns:wpi="http://schemas.microsoft.com/office/word/2010/wordprocessingInk" xmlns:wne="http://schemas.microsoft.com/office/word/2006/wordml" xmlns:wps="http://schemas.microsoft.com/office/word/2010/wordprocessingShape" mc:Ignorable="w14 w15 w16se w16cid w16 w16cex w16sdtdh w16sdtfl w16du wp14">
   <w:background w:color="FFFFFF"/>
   <w:body>
     <w:p/>
@@ -493,9 +493,11 @@
         <w:rPr>
           <w:rFonts w:asciiTheme="minorHAnsi" w:eastAsiaTheme="minorEastAsia" w:hAnsiTheme="minorHAnsi" w:cstheme="minorBidi"/>
           <w:noProof/>
-          <w:sz w:val="22"/>
-          <w:szCs w:val="22"/>
+          <w:kern w:val="2"/>
+          <w:sz w:val="24"/>
+          <w:szCs w:val="24"/>
           <w:lang w:val="de-AT" w:eastAsia="de-AT"/>
+          <w14:ligatures w14:val="standardContextual"/>
         </w:rPr>
       </w:pPr>
       <w:r>
@@ -517,9 +519,11 @@
         <w:rPr>
           <w:rFonts w:asciiTheme="minorHAnsi" w:eastAsiaTheme="minorEastAsia" w:hAnsiTheme="minorHAnsi" w:cstheme="minorBidi"/>
           <w:noProof/>
-          <w:sz w:val="22"/>
-          <w:szCs w:val="22"/>
+          <w:kern w:val="2"/>
+          <w:sz w:val="24"/>
+          <w:szCs w:val="24"/>
           <w:lang w:val="de-AT" w:eastAsia="de-AT"/>
+          <w14:ligatures w14:val="standardContextual"/>
         </w:rPr>
         <w:tab/>
       </w:r>
@@ -527,7 +531,7 @@
         <w:rPr>
           <w:noProof/>
         </w:rPr>
-        <w:t>Theorie zur Übung</w:t>
+        <w:t>Begriffsdefinition</w:t>
       </w:r>
       <w:r>
         <w:rPr>
@@ -545,7 +549,7 @@
         <w:rPr>
           <w:noProof/>
         </w:rPr>
-        <w:instrText xml:space="preserve"> PAGEREF _Toc524250386 \h </w:instrText>
+        <w:instrText xml:space="preserve"> PAGEREF _Toc236315610 \h </w:instrText>
       </w:r>
       <w:r>
         <w:rPr>
@@ -581,9 +585,11 @@
         <w:rPr>
           <w:rFonts w:asciiTheme="minorHAnsi" w:eastAsiaTheme="minorEastAsia" w:hAnsiTheme="minorHAnsi" w:cstheme="minorBidi"/>
           <w:noProof/>
-          <w:sz w:val="22"/>
-          <w:szCs w:val="22"/>
+          <w:kern w:val="2"/>
+          <w:sz w:val="24"/>
+          <w:szCs w:val="24"/>
           <w:lang w:val="de-AT" w:eastAsia="de-AT"/>
+          <w14:ligatures w14:val="standardContextual"/>
         </w:rPr>
       </w:pPr>
       <w:r>
@@ -596,9 +602,11 @@
         <w:rPr>
           <w:rFonts w:asciiTheme="minorHAnsi" w:eastAsiaTheme="minorEastAsia" w:hAnsiTheme="minorHAnsi" w:cstheme="minorBidi"/>
           <w:noProof/>
-          <w:sz w:val="22"/>
-          <w:szCs w:val="22"/>
+          <w:kern w:val="2"/>
+          <w:sz w:val="24"/>
+          <w:szCs w:val="24"/>
           <w:lang w:val="de-AT" w:eastAsia="de-AT"/>
+          <w14:ligatures w14:val="standardContextual"/>
         </w:rPr>
         <w:tab/>
       </w:r>
@@ -606,7 +614,7 @@
         <w:rPr>
           <w:noProof/>
         </w:rPr>
-        <w:t>Titel – Übungsaufgabe 1</w:t>
+        <w:t>Theorie der Arbeit</w:t>
       </w:r>
       <w:r>
         <w:rPr>
@@ -624,7 +632,7 @@
         <w:rPr>
           <w:noProof/>
         </w:rPr>
-        <w:instrText xml:space="preserve"> PAGEREF _Toc524250387 \h </w:instrText>
+        <w:instrText xml:space="preserve"> PAGEREF _Toc236315611 \h </w:instrText>
       </w:r>
       <w:r>
         <w:rPr>
@@ -641,7 +649,7 @@
         <w:rPr>
           <w:noProof/>
         </w:rPr>
-        <w:t>3</w:t>
+        <w:t>4</w:t>
       </w:r>
       <w:r>
         <w:rPr>
@@ -660,13 +668,16 @@
         <w:rPr>
           <w:rFonts w:asciiTheme="minorHAnsi" w:eastAsiaTheme="minorEastAsia" w:hAnsiTheme="minorHAnsi" w:cstheme="minorBidi"/>
           <w:noProof/>
-          <w:sz w:val="22"/>
-          <w:szCs w:val="22"/>
+          <w:kern w:val="2"/>
+          <w:sz w:val="24"/>
+          <w:szCs w:val="24"/>
           <w:lang w:val="de-AT" w:eastAsia="de-AT"/>
-        </w:rPr>
-      </w:pPr>
-      <w:r>
-        <w:rPr>
+          <w14:ligatures w14:val="standardContextual"/>
+        </w:rPr>
+      </w:pPr>
+      <w:r>
+        <w:rPr>
+          <w:rFonts w:eastAsia="TimesNewRomanPSMT"/>
           <w:noProof/>
         </w:rPr>
         <w:t>2.1</w:t>
@@ -675,17 +686,20 @@
         <w:rPr>
           <w:rFonts w:asciiTheme="minorHAnsi" w:eastAsiaTheme="minorEastAsia" w:hAnsiTheme="minorHAnsi" w:cstheme="minorBidi"/>
           <w:noProof/>
-          <w:sz w:val="22"/>
-          <w:szCs w:val="22"/>
+          <w:kern w:val="2"/>
+          <w:sz w:val="24"/>
+          <w:szCs w:val="24"/>
           <w:lang w:val="de-AT" w:eastAsia="de-AT"/>
+          <w14:ligatures w14:val="standardContextual"/>
         </w:rPr>
         <w:tab/>
       </w:r>
       <w:r>
         <w:rPr>
-          <w:noProof/>
-        </w:rPr>
-        <w:t>Aufgabenstellung</w:t>
+          <w:rFonts w:eastAsia="TimesNewRomanPSMT"/>
+          <w:noProof/>
+        </w:rPr>
+        <w:t>Grundlagen von Feldeffekttransistoren</w:t>
       </w:r>
       <w:r>
         <w:rPr>
@@ -703,7 +717,7 @@
         <w:rPr>
           <w:noProof/>
         </w:rPr>
-        <w:instrText xml:space="preserve"> PAGEREF _Toc524250388 \h </w:instrText>
+        <w:instrText xml:space="preserve"> PAGEREF _Toc236315612 \h </w:instrText>
       </w:r>
       <w:r>
         <w:rPr>
@@ -720,7 +734,90 @@
         <w:rPr>
           <w:noProof/>
         </w:rPr>
+        <w:t>4</w:t>
+      </w:r>
+      <w:r>
+        <w:rPr>
+          <w:noProof/>
+        </w:rPr>
+        <w:fldChar w:fldCharType="end"/>
+      </w:r>
+    </w:p>
+    <w:p>
+      <w:pPr>
+        <w:pStyle w:val="Verzeichnis1"/>
+        <w:tabs>
+          <w:tab w:val="left" w:pos="400"/>
+          <w:tab w:val="right" w:leader="dot" w:pos="9060"/>
+        </w:tabs>
+        <w:rPr>
+          <w:rFonts w:asciiTheme="minorHAnsi" w:eastAsiaTheme="minorEastAsia" w:hAnsiTheme="minorHAnsi" w:cstheme="minorBidi"/>
+          <w:noProof/>
+          <w:kern w:val="2"/>
+          <w:sz w:val="24"/>
+          <w:szCs w:val="24"/>
+          <w:lang w:val="de-AT" w:eastAsia="de-AT"/>
+          <w14:ligatures w14:val="standardContextual"/>
+        </w:rPr>
+      </w:pPr>
+      <w:r>
+        <w:rPr>
+          <w:noProof/>
+        </w:rPr>
         <w:t>3</w:t>
+      </w:r>
+      <w:r>
+        <w:rPr>
+          <w:rFonts w:asciiTheme="minorHAnsi" w:eastAsiaTheme="minorEastAsia" w:hAnsiTheme="minorHAnsi" w:cstheme="minorBidi"/>
+          <w:noProof/>
+          <w:kern w:val="2"/>
+          <w:sz w:val="24"/>
+          <w:szCs w:val="24"/>
+          <w:lang w:val="de-AT" w:eastAsia="de-AT"/>
+          <w14:ligatures w14:val="standardContextual"/>
+        </w:rPr>
+        <w:tab/>
+      </w:r>
+      <w:r>
+        <w:rPr>
+          <w:noProof/>
+        </w:rPr>
+        <w:t>Grundlage der MOSFET Vermessung</w:t>
+      </w:r>
+      <w:r>
+        <w:rPr>
+          <w:noProof/>
+        </w:rPr>
+        <w:tab/>
+      </w:r>
+      <w:r>
+        <w:rPr>
+          <w:noProof/>
+        </w:rPr>
+        <w:fldChar w:fldCharType="begin"/>
+      </w:r>
+      <w:r>
+        <w:rPr>
+          <w:noProof/>
+        </w:rPr>
+        <w:instrText xml:space="preserve"> PAGEREF _Toc236315613 \h </w:instrText>
+      </w:r>
+      <w:r>
+        <w:rPr>
+          <w:noProof/>
+        </w:rPr>
+      </w:r>
+      <w:r>
+        <w:rPr>
+          <w:noProof/>
+        </w:rPr>
+        <w:fldChar w:fldCharType="separate"/>
+      </w:r>
+      <w:r>
+        <w:rPr>
+          <w:noProof/>
+        </w:rPr>
+        <w:t>4</w:t>
       </w:r>
       <w:r>
         <w:rPr>
@@ -739,34 +836,36 @@
         <w:rPr>
           <w:rFonts w:asciiTheme="minorHAnsi" w:eastAsiaTheme="minorEastAsia" w:hAnsiTheme="minorHAnsi" w:cstheme="minorBidi"/>
           <w:noProof/>
-          <w:sz w:val="22"/>
-          <w:szCs w:val="22"/>
+          <w:kern w:val="2"/>
+          <w:sz w:val="24"/>
+          <w:szCs w:val="24"/>
           <w:lang w:val="de-AT" w:eastAsia="de-AT"/>
-        </w:rPr>
-      </w:pPr>
-      <w:r>
-        <w:rPr>
-          <w:rFonts w:eastAsia="TimesNewRomanPSMT" w:cs="TimesNewRomanPSMT"/>
-          <w:noProof/>
-        </w:rPr>
-        <w:t>2.2</w:t>
+          <w14:ligatures w14:val="standardContextual"/>
+        </w:rPr>
+      </w:pPr>
+      <w:r>
+        <w:rPr>
+          <w:noProof/>
+        </w:rPr>
+        <w:t>3.1</w:t>
       </w:r>
       <w:r>
         <w:rPr>
           <w:rFonts w:asciiTheme="minorHAnsi" w:eastAsiaTheme="minorEastAsia" w:hAnsiTheme="minorHAnsi" w:cstheme="minorBidi"/>
           <w:noProof/>
-          <w:sz w:val="22"/>
-          <w:szCs w:val="22"/>
+          <w:kern w:val="2"/>
+          <w:sz w:val="24"/>
+          <w:szCs w:val="24"/>
           <w:lang w:val="de-AT" w:eastAsia="de-AT"/>
+          <w14:ligatures w14:val="standardContextual"/>
         </w:rPr>
         <w:tab/>
       </w:r>
       <w:r>
         <w:rPr>
-          <w:rFonts w:eastAsia="TimesNewRomanPSMT" w:cs="TimesNewRomanPSMT"/>
-          <w:noProof/>
-        </w:rPr>
-        <w:t>Berechnung</w:t>
+          <w:noProof/>
+        </w:rPr>
+        <w:t>MOSFET Parameter</w:t>
       </w:r>
       <w:r>
         <w:rPr>
@@ -784,7 +883,7 @@
         <w:rPr>
           <w:noProof/>
         </w:rPr>
-        <w:instrText xml:space="preserve"> PAGEREF _Toc524250389 \h </w:instrText>
+        <w:instrText xml:space="preserve"> PAGEREF _Toc236315614 \h </w:instrText>
       </w:r>
       <w:r>
         <w:rPr>
@@ -801,7 +900,7 @@
         <w:rPr>
           <w:noProof/>
         </w:rPr>
-        <w:t>3</w:t>
+        <w:t>4</w:t>
       </w:r>
       <w:r>
         <w:rPr>
@@ -820,9 +919,11 @@
         <w:rPr>
           <w:rFonts w:asciiTheme="minorHAnsi" w:eastAsiaTheme="minorEastAsia" w:hAnsiTheme="minorHAnsi" w:cstheme="minorBidi"/>
           <w:noProof/>
-          <w:sz w:val="22"/>
-          <w:szCs w:val="22"/>
+          <w:kern w:val="2"/>
+          <w:sz w:val="24"/>
+          <w:szCs w:val="24"/>
           <w:lang w:val="de-AT" w:eastAsia="de-AT"/>
+          <w14:ligatures w14:val="standardContextual"/>
         </w:rPr>
       </w:pPr>
       <w:r>
@@ -830,15 +931,17 @@
           <w:rFonts w:eastAsia="TimesNewRomanPSMT" w:cs="TimesNewRomanPSMT"/>
           <w:noProof/>
         </w:rPr>
-        <w:t>2.3</w:t>
+        <w:t>3.2</w:t>
       </w:r>
       <w:r>
         <w:rPr>
           <w:rFonts w:asciiTheme="minorHAnsi" w:eastAsiaTheme="minorEastAsia" w:hAnsiTheme="minorHAnsi" w:cstheme="minorBidi"/>
           <w:noProof/>
-          <w:sz w:val="22"/>
-          <w:szCs w:val="22"/>
+          <w:kern w:val="2"/>
+          <w:sz w:val="24"/>
+          <w:szCs w:val="24"/>
           <w:lang w:val="de-AT" w:eastAsia="de-AT"/>
+          <w14:ligatures w14:val="standardContextual"/>
         </w:rPr>
         <w:tab/>
       </w:r>
@@ -847,7 +950,7 @@
           <w:rFonts w:eastAsia="TimesNewRomanPSMT" w:cs="TimesNewRomanPSMT"/>
           <w:noProof/>
         </w:rPr>
-        <w:t>Messschaltung</w:t>
+        <w:t>Messung von MOSFET Parameter</w:t>
       </w:r>
       <w:r>
         <w:rPr>
@@ -865,7 +968,7 @@
         <w:rPr>
           <w:noProof/>
         </w:rPr>
-        <w:instrText xml:space="preserve"> PAGEREF _Toc524250390 \h </w:instrText>
+        <w:instrText xml:space="preserve"> PAGEREF _Toc236315615 \h </w:instrText>
       </w:r>
       <w:r>
         <w:rPr>
@@ -882,7 +985,7 @@
         <w:rPr>
           <w:noProof/>
         </w:rPr>
-        <w:t>3</w:t>
+        <w:t>4</w:t>
       </w:r>
       <w:r>
         <w:rPr>
@@ -901,34 +1004,36 @@
         <w:rPr>
           <w:rFonts w:asciiTheme="minorHAnsi" w:eastAsiaTheme="minorEastAsia" w:hAnsiTheme="minorHAnsi" w:cstheme="minorBidi"/>
           <w:noProof/>
-          <w:sz w:val="22"/>
-          <w:szCs w:val="22"/>
+          <w:kern w:val="2"/>
+          <w:sz w:val="24"/>
+          <w:szCs w:val="24"/>
           <w:lang w:val="de-AT" w:eastAsia="de-AT"/>
-        </w:rPr>
-      </w:pPr>
-      <w:r>
-        <w:rPr>
-          <w:rFonts w:eastAsia="TimesNewRomanPSMT" w:cs="TimesNewRomanPSMT"/>
-          <w:noProof/>
-        </w:rPr>
-        <w:t>2.4</w:t>
+          <w14:ligatures w14:val="standardContextual"/>
+        </w:rPr>
+      </w:pPr>
+      <w:r>
+        <w:rPr>
+          <w:noProof/>
+        </w:rPr>
+        <w:t>3.3</w:t>
       </w:r>
       <w:r>
         <w:rPr>
           <w:rFonts w:asciiTheme="minorHAnsi" w:eastAsiaTheme="minorEastAsia" w:hAnsiTheme="minorHAnsi" w:cstheme="minorBidi"/>
           <w:noProof/>
-          <w:sz w:val="22"/>
-          <w:szCs w:val="22"/>
+          <w:kern w:val="2"/>
+          <w:sz w:val="24"/>
+          <w:szCs w:val="24"/>
           <w:lang w:val="de-AT" w:eastAsia="de-AT"/>
+          <w14:ligatures w14:val="standardContextual"/>
         </w:rPr>
         <w:tab/>
       </w:r>
       <w:r>
         <w:rPr>
-          <w:rFonts w:eastAsia="TimesNewRomanPSMT" w:cs="TimesNewRomanPSMT"/>
-          <w:noProof/>
-        </w:rPr>
-        <w:t>Messvorgang</w:t>
+          <w:noProof/>
+        </w:rPr>
+        <w:t>Messungsaufbau</w:t>
       </w:r>
       <w:r>
         <w:rPr>
@@ -946,7 +1051,7 @@
         <w:rPr>
           <w:noProof/>
         </w:rPr>
-        <w:instrText xml:space="preserve"> PAGEREF _Toc524250391 \h </w:instrText>
+        <w:instrText xml:space="preserve"> PAGEREF _Toc236315616 \h </w:instrText>
       </w:r>
       <w:r>
         <w:rPr>
@@ -963,7 +1068,256 @@
         <w:rPr>
           <w:noProof/>
         </w:rPr>
-        <w:t>3</w:t>
+        <w:t>5</w:t>
+      </w:r>
+      <w:r>
+        <w:rPr>
+          <w:noProof/>
+        </w:rPr>
+        <w:fldChar w:fldCharType="end"/>
+      </w:r>
+    </w:p>
+    <w:p>
+      <w:pPr>
+        <w:pStyle w:val="Verzeichnis3"/>
+        <w:tabs>
+          <w:tab w:val="left" w:pos="1200"/>
+          <w:tab w:val="right" w:leader="dot" w:pos="9060"/>
+        </w:tabs>
+        <w:rPr>
+          <w:rFonts w:asciiTheme="minorHAnsi" w:eastAsiaTheme="minorEastAsia" w:hAnsiTheme="minorHAnsi" w:cstheme="minorBidi"/>
+          <w:noProof/>
+          <w:kern w:val="2"/>
+          <w:sz w:val="24"/>
+          <w:szCs w:val="24"/>
+          <w:lang w:val="de-AT" w:eastAsia="de-AT"/>
+          <w14:ligatures w14:val="standardContextual"/>
+        </w:rPr>
+      </w:pPr>
+      <w:r>
+        <w:rPr>
+          <w:noProof/>
+        </w:rPr>
+        <w:t>3.3.1</w:t>
+      </w:r>
+      <w:r>
+        <w:rPr>
+          <w:rFonts w:asciiTheme="minorHAnsi" w:eastAsiaTheme="minorEastAsia" w:hAnsiTheme="minorHAnsi" w:cstheme="minorBidi"/>
+          <w:noProof/>
+          <w:kern w:val="2"/>
+          <w:sz w:val="24"/>
+          <w:szCs w:val="24"/>
+          <w:lang w:val="de-AT" w:eastAsia="de-AT"/>
+          <w14:ligatures w14:val="standardContextual"/>
+        </w:rPr>
+        <w:tab/>
+      </w:r>
+      <w:r>
+        <w:rPr>
+          <w:noProof/>
+        </w:rPr>
+        <w:t>Grenzfrequenz</w:t>
+      </w:r>
+      <w:r>
+        <w:rPr>
+          <w:noProof/>
+        </w:rPr>
+        <w:tab/>
+      </w:r>
+      <w:r>
+        <w:rPr>
+          <w:noProof/>
+        </w:rPr>
+        <w:fldChar w:fldCharType="begin"/>
+      </w:r>
+      <w:r>
+        <w:rPr>
+          <w:noProof/>
+        </w:rPr>
+        <w:instrText xml:space="preserve"> PAGEREF _Toc236315617 \h </w:instrText>
+      </w:r>
+      <w:r>
+        <w:rPr>
+          <w:noProof/>
+        </w:rPr>
+      </w:r>
+      <w:r>
+        <w:rPr>
+          <w:noProof/>
+        </w:rPr>
+        <w:fldChar w:fldCharType="separate"/>
+      </w:r>
+      <w:r>
+        <w:rPr>
+          <w:noProof/>
+        </w:rPr>
+        <w:t>6</w:t>
+      </w:r>
+      <w:r>
+        <w:rPr>
+          <w:noProof/>
+        </w:rPr>
+        <w:fldChar w:fldCharType="end"/>
+      </w:r>
+    </w:p>
+    <w:p>
+      <w:pPr>
+        <w:pStyle w:val="Verzeichnis3"/>
+        <w:tabs>
+          <w:tab w:val="left" w:pos="1200"/>
+          <w:tab w:val="right" w:leader="dot" w:pos="9060"/>
+        </w:tabs>
+        <w:rPr>
+          <w:rFonts w:asciiTheme="minorHAnsi" w:eastAsiaTheme="minorEastAsia" w:hAnsiTheme="minorHAnsi" w:cstheme="minorBidi"/>
+          <w:noProof/>
+          <w:kern w:val="2"/>
+          <w:sz w:val="24"/>
+          <w:szCs w:val="24"/>
+          <w:lang w:val="de-AT" w:eastAsia="de-AT"/>
+          <w14:ligatures w14:val="standardContextual"/>
+        </w:rPr>
+      </w:pPr>
+      <w:r>
+        <w:rPr>
+          <w:noProof/>
+        </w:rPr>
+        <w:t>3.3.2</w:t>
+      </w:r>
+      <w:r>
+        <w:rPr>
+          <w:rFonts w:asciiTheme="minorHAnsi" w:eastAsiaTheme="minorEastAsia" w:hAnsiTheme="minorHAnsi" w:cstheme="minorBidi"/>
+          <w:noProof/>
+          <w:kern w:val="2"/>
+          <w:sz w:val="24"/>
+          <w:szCs w:val="24"/>
+          <w:lang w:val="de-AT" w:eastAsia="de-AT"/>
+          <w14:ligatures w14:val="standardContextual"/>
+        </w:rPr>
+        <w:tab/>
+      </w:r>
+      <w:r>
+        <w:rPr>
+          <w:noProof/>
+        </w:rPr>
+        <w:t>Thermisches Rauschen</w:t>
+      </w:r>
+      <w:r>
+        <w:rPr>
+          <w:noProof/>
+        </w:rPr>
+        <w:tab/>
+      </w:r>
+      <w:r>
+        <w:rPr>
+          <w:noProof/>
+        </w:rPr>
+        <w:fldChar w:fldCharType="begin"/>
+      </w:r>
+      <w:r>
+        <w:rPr>
+          <w:noProof/>
+        </w:rPr>
+        <w:instrText xml:space="preserve"> PAGEREF _Toc236315618 \h </w:instrText>
+      </w:r>
+      <w:r>
+        <w:rPr>
+          <w:noProof/>
+        </w:rPr>
+      </w:r>
+      <w:r>
+        <w:rPr>
+          <w:noProof/>
+        </w:rPr>
+        <w:fldChar w:fldCharType="separate"/>
+      </w:r>
+      <w:r>
+        <w:rPr>
+          <w:noProof/>
+        </w:rPr>
+        <w:t>6</w:t>
+      </w:r>
+      <w:r>
+        <w:rPr>
+          <w:noProof/>
+        </w:rPr>
+        <w:fldChar w:fldCharType="end"/>
+      </w:r>
+    </w:p>
+    <w:p>
+      <w:pPr>
+        <w:pStyle w:val="Verzeichnis1"/>
+        <w:tabs>
+          <w:tab w:val="left" w:pos="400"/>
+          <w:tab w:val="right" w:leader="dot" w:pos="9060"/>
+        </w:tabs>
+        <w:rPr>
+          <w:rFonts w:asciiTheme="minorHAnsi" w:eastAsiaTheme="minorEastAsia" w:hAnsiTheme="minorHAnsi" w:cstheme="minorBidi"/>
+          <w:noProof/>
+          <w:kern w:val="2"/>
+          <w:sz w:val="24"/>
+          <w:szCs w:val="24"/>
+          <w:lang w:val="de-AT" w:eastAsia="de-AT"/>
+          <w14:ligatures w14:val="standardContextual"/>
+        </w:rPr>
+      </w:pPr>
+      <w:r>
+        <w:rPr>
+          <w:noProof/>
+        </w:rPr>
+        <w:t>4</w:t>
+      </w:r>
+      <w:r>
+        <w:rPr>
+          <w:rFonts w:asciiTheme="minorHAnsi" w:eastAsiaTheme="minorEastAsia" w:hAnsiTheme="minorHAnsi" w:cstheme="minorBidi"/>
+          <w:noProof/>
+          <w:kern w:val="2"/>
+          <w:sz w:val="24"/>
+          <w:szCs w:val="24"/>
+          <w:lang w:val="de-AT" w:eastAsia="de-AT"/>
+          <w14:ligatures w14:val="standardContextual"/>
+        </w:rPr>
+        <w:tab/>
+      </w:r>
+      <w:r>
+        <w:rPr>
+          <w:noProof/>
+        </w:rPr>
+        <w:t>Schaltungs-erstellung Blockdiagramm</w:t>
+      </w:r>
+      <w:r>
+        <w:rPr>
+          <w:noProof/>
+        </w:rPr>
+        <w:tab/>
+      </w:r>
+      <w:r>
+        <w:rPr>
+          <w:noProof/>
+        </w:rPr>
+        <w:fldChar w:fldCharType="begin"/>
+      </w:r>
+      <w:r>
+        <w:rPr>
+          <w:noProof/>
+        </w:rPr>
+        <w:instrText xml:space="preserve"> PAGEREF _Toc236315619 \h </w:instrText>
+      </w:r>
+      <w:r>
+        <w:rPr>
+          <w:noProof/>
+        </w:rPr>
+      </w:r>
+      <w:r>
+        <w:rPr>
+          <w:noProof/>
+        </w:rPr>
+        <w:fldChar w:fldCharType="separate"/>
+      </w:r>
+      <w:r>
+        <w:rPr>
+          <w:noProof/>
+        </w:rPr>
+        <w:t>7</w:t>
       </w:r>
       <w:r>
         <w:rPr>
@@ -982,34 +1336,36 @@
         <w:rPr>
           <w:rFonts w:asciiTheme="minorHAnsi" w:eastAsiaTheme="minorEastAsia" w:hAnsiTheme="minorHAnsi" w:cstheme="minorBidi"/>
           <w:noProof/>
-          <w:sz w:val="22"/>
-          <w:szCs w:val="22"/>
+          <w:kern w:val="2"/>
+          <w:sz w:val="24"/>
+          <w:szCs w:val="24"/>
           <w:lang w:val="de-AT" w:eastAsia="de-AT"/>
-        </w:rPr>
-      </w:pPr>
-      <w:r>
-        <w:rPr>
-          <w:rFonts w:eastAsia="TimesNewRomanPSMT" w:cs="TimesNewRomanPSMT"/>
-          <w:noProof/>
-        </w:rPr>
-        <w:t>2.5</w:t>
+          <w14:ligatures w14:val="standardContextual"/>
+        </w:rPr>
+      </w:pPr>
+      <w:r>
+        <w:rPr>
+          <w:noProof/>
+        </w:rPr>
+        <w:t>4.1</w:t>
       </w:r>
       <w:r>
         <w:rPr>
           <w:rFonts w:asciiTheme="minorHAnsi" w:eastAsiaTheme="minorEastAsia" w:hAnsiTheme="minorHAnsi" w:cstheme="minorBidi"/>
           <w:noProof/>
-          <w:sz w:val="22"/>
-          <w:szCs w:val="22"/>
+          <w:kern w:val="2"/>
+          <w:sz w:val="24"/>
+          <w:szCs w:val="24"/>
           <w:lang w:val="de-AT" w:eastAsia="de-AT"/>
+          <w14:ligatures w14:val="standardContextual"/>
         </w:rPr>
         <w:tab/>
       </w:r>
       <w:r>
         <w:rPr>
-          <w:rFonts w:eastAsia="TimesNewRomanPSMT" w:cs="TimesNewRomanPSMT"/>
-          <w:noProof/>
-        </w:rPr>
-        <w:t>Messtabelle</w:t>
+          <w:noProof/>
+        </w:rPr>
+        <w:t>Spannungsversorgung</w:t>
       </w:r>
       <w:r>
         <w:rPr>
@@ -1027,7 +1383,7 @@
         <w:rPr>
           <w:noProof/>
         </w:rPr>
-        <w:instrText xml:space="preserve"> PAGEREF _Toc524250392 \h </w:instrText>
+        <w:instrText xml:space="preserve"> PAGEREF _Toc236315620 \h </w:instrText>
       </w:r>
       <w:r>
         <w:rPr>
@@ -1044,7 +1400,256 @@
         <w:rPr>
           <w:noProof/>
         </w:rPr>
-        <w:t>3</w:t>
+        <w:t>7</w:t>
+      </w:r>
+      <w:r>
+        <w:rPr>
+          <w:noProof/>
+        </w:rPr>
+        <w:fldChar w:fldCharType="end"/>
+      </w:r>
+    </w:p>
+    <w:p>
+      <w:pPr>
+        <w:pStyle w:val="Verzeichnis3"/>
+        <w:tabs>
+          <w:tab w:val="left" w:pos="1200"/>
+          <w:tab w:val="right" w:leader="dot" w:pos="9060"/>
+        </w:tabs>
+        <w:rPr>
+          <w:rFonts w:asciiTheme="minorHAnsi" w:eastAsiaTheme="minorEastAsia" w:hAnsiTheme="minorHAnsi" w:cstheme="minorBidi"/>
+          <w:noProof/>
+          <w:kern w:val="2"/>
+          <w:sz w:val="24"/>
+          <w:szCs w:val="24"/>
+          <w:lang w:val="de-AT" w:eastAsia="de-AT"/>
+          <w14:ligatures w14:val="standardContextual"/>
+        </w:rPr>
+      </w:pPr>
+      <w:r>
+        <w:rPr>
+          <w:noProof/>
+        </w:rPr>
+        <w:t>4.1.1</w:t>
+      </w:r>
+      <w:r>
+        <w:rPr>
+          <w:rFonts w:asciiTheme="minorHAnsi" w:eastAsiaTheme="minorEastAsia" w:hAnsiTheme="minorHAnsi" w:cstheme="minorBidi"/>
+          <w:noProof/>
+          <w:kern w:val="2"/>
+          <w:sz w:val="24"/>
+          <w:szCs w:val="24"/>
+          <w:lang w:val="de-AT" w:eastAsia="de-AT"/>
+          <w14:ligatures w14:val="standardContextual"/>
+        </w:rPr>
+        <w:tab/>
+      </w:r>
+      <w:r>
+        <w:rPr>
+          <w:noProof/>
+        </w:rPr>
+        <w:t>LT3042</w:t>
+      </w:r>
+      <w:r>
+        <w:rPr>
+          <w:noProof/>
+        </w:rPr>
+        <w:tab/>
+      </w:r>
+      <w:r>
+        <w:rPr>
+          <w:noProof/>
+        </w:rPr>
+        <w:fldChar w:fldCharType="begin"/>
+      </w:r>
+      <w:r>
+        <w:rPr>
+          <w:noProof/>
+        </w:rPr>
+        <w:instrText xml:space="preserve"> PAGEREF _Toc236315621 \h </w:instrText>
+      </w:r>
+      <w:r>
+        <w:rPr>
+          <w:noProof/>
+        </w:rPr>
+      </w:r>
+      <w:r>
+        <w:rPr>
+          <w:noProof/>
+        </w:rPr>
+        <w:fldChar w:fldCharType="separate"/>
+      </w:r>
+      <w:r>
+        <w:rPr>
+          <w:noProof/>
+        </w:rPr>
+        <w:t>8</w:t>
+      </w:r>
+      <w:r>
+        <w:rPr>
+          <w:noProof/>
+        </w:rPr>
+        <w:fldChar w:fldCharType="end"/>
+      </w:r>
+    </w:p>
+    <w:p>
+      <w:pPr>
+        <w:pStyle w:val="Verzeichnis3"/>
+        <w:tabs>
+          <w:tab w:val="left" w:pos="1200"/>
+          <w:tab w:val="right" w:leader="dot" w:pos="9060"/>
+        </w:tabs>
+        <w:rPr>
+          <w:rFonts w:asciiTheme="minorHAnsi" w:eastAsiaTheme="minorEastAsia" w:hAnsiTheme="minorHAnsi" w:cstheme="minorBidi"/>
+          <w:noProof/>
+          <w:kern w:val="2"/>
+          <w:sz w:val="24"/>
+          <w:szCs w:val="24"/>
+          <w:lang w:val="de-AT" w:eastAsia="de-AT"/>
+          <w14:ligatures w14:val="standardContextual"/>
+        </w:rPr>
+      </w:pPr>
+      <w:r>
+        <w:rPr>
+          <w:noProof/>
+        </w:rPr>
+        <w:t>4.1.2</w:t>
+      </w:r>
+      <w:r>
+        <w:rPr>
+          <w:rFonts w:asciiTheme="minorHAnsi" w:eastAsiaTheme="minorEastAsia" w:hAnsiTheme="minorHAnsi" w:cstheme="minorBidi"/>
+          <w:noProof/>
+          <w:kern w:val="2"/>
+          <w:sz w:val="24"/>
+          <w:szCs w:val="24"/>
+          <w:lang w:val="de-AT" w:eastAsia="de-AT"/>
+          <w14:ligatures w14:val="standardContextual"/>
+        </w:rPr>
+        <w:tab/>
+      </w:r>
+      <w:r>
+        <w:rPr>
+          <w:noProof/>
+        </w:rPr>
+        <w:t>TLV76733</w:t>
+      </w:r>
+      <w:r>
+        <w:rPr>
+          <w:noProof/>
+        </w:rPr>
+        <w:tab/>
+      </w:r>
+      <w:r>
+        <w:rPr>
+          <w:noProof/>
+        </w:rPr>
+        <w:fldChar w:fldCharType="begin"/>
+      </w:r>
+      <w:r>
+        <w:rPr>
+          <w:noProof/>
+        </w:rPr>
+        <w:instrText xml:space="preserve"> PAGEREF _Toc236315622 \h </w:instrText>
+      </w:r>
+      <w:r>
+        <w:rPr>
+          <w:noProof/>
+        </w:rPr>
+      </w:r>
+      <w:r>
+        <w:rPr>
+          <w:noProof/>
+        </w:rPr>
+        <w:fldChar w:fldCharType="separate"/>
+      </w:r>
+      <w:r>
+        <w:rPr>
+          <w:noProof/>
+        </w:rPr>
+        <w:t>9</w:t>
+      </w:r>
+      <w:r>
+        <w:rPr>
+          <w:noProof/>
+        </w:rPr>
+        <w:fldChar w:fldCharType="end"/>
+      </w:r>
+    </w:p>
+    <w:p>
+      <w:pPr>
+        <w:pStyle w:val="Verzeichnis1"/>
+        <w:tabs>
+          <w:tab w:val="left" w:pos="400"/>
+          <w:tab w:val="right" w:leader="dot" w:pos="9060"/>
+        </w:tabs>
+        <w:rPr>
+          <w:rFonts w:asciiTheme="minorHAnsi" w:eastAsiaTheme="minorEastAsia" w:hAnsiTheme="minorHAnsi" w:cstheme="minorBidi"/>
+          <w:noProof/>
+          <w:kern w:val="2"/>
+          <w:sz w:val="24"/>
+          <w:szCs w:val="24"/>
+          <w:lang w:val="de-AT" w:eastAsia="de-AT"/>
+          <w14:ligatures w14:val="standardContextual"/>
+        </w:rPr>
+      </w:pPr>
+      <w:r>
+        <w:rPr>
+          <w:noProof/>
+        </w:rPr>
+        <w:t>5</w:t>
+      </w:r>
+      <w:r>
+        <w:rPr>
+          <w:rFonts w:asciiTheme="minorHAnsi" w:eastAsiaTheme="minorEastAsia" w:hAnsiTheme="minorHAnsi" w:cstheme="minorBidi"/>
+          <w:noProof/>
+          <w:kern w:val="2"/>
+          <w:sz w:val="24"/>
+          <w:szCs w:val="24"/>
+          <w:lang w:val="de-AT" w:eastAsia="de-AT"/>
+          <w14:ligatures w14:val="standardContextual"/>
+        </w:rPr>
+        <w:tab/>
+      </w:r>
+      <w:r>
+        <w:rPr>
+          <w:noProof/>
+        </w:rPr>
+        <w:t>ADC</w:t>
+      </w:r>
+      <w:r>
+        <w:rPr>
+          <w:noProof/>
+        </w:rPr>
+        <w:tab/>
+      </w:r>
+      <w:r>
+        <w:rPr>
+          <w:noProof/>
+        </w:rPr>
+        <w:fldChar w:fldCharType="begin"/>
+      </w:r>
+      <w:r>
+        <w:rPr>
+          <w:noProof/>
+        </w:rPr>
+        <w:instrText xml:space="preserve"> PAGEREF _Toc236315623 \h </w:instrText>
+      </w:r>
+      <w:r>
+        <w:rPr>
+          <w:noProof/>
+        </w:rPr>
+      </w:r>
+      <w:r>
+        <w:rPr>
+          <w:noProof/>
+        </w:rPr>
+        <w:fldChar w:fldCharType="separate"/>
+      </w:r>
+      <w:r>
+        <w:rPr>
+          <w:noProof/>
+        </w:rPr>
+        <w:t>9</w:t>
       </w:r>
       <w:r>
         <w:rPr>
@@ -1063,34 +1668,36 @@
         <w:rPr>
           <w:rFonts w:asciiTheme="minorHAnsi" w:eastAsiaTheme="minorEastAsia" w:hAnsiTheme="minorHAnsi" w:cstheme="minorBidi"/>
           <w:noProof/>
-          <w:sz w:val="22"/>
-          <w:szCs w:val="22"/>
+          <w:kern w:val="2"/>
+          <w:sz w:val="24"/>
+          <w:szCs w:val="24"/>
           <w:lang w:val="de-AT" w:eastAsia="de-AT"/>
-        </w:rPr>
-      </w:pPr>
-      <w:r>
-        <w:rPr>
-          <w:rFonts w:eastAsia="TimesNewRomanPSMT" w:cs="TimesNewRomanPSMT"/>
-          <w:noProof/>
-        </w:rPr>
-        <w:t>2.6</w:t>
+          <w14:ligatures w14:val="standardContextual"/>
+        </w:rPr>
+      </w:pPr>
+      <w:r>
+        <w:rPr>
+          <w:noProof/>
+        </w:rPr>
+        <w:t>5.1</w:t>
       </w:r>
       <w:r>
         <w:rPr>
           <w:rFonts w:asciiTheme="minorHAnsi" w:eastAsiaTheme="minorEastAsia" w:hAnsiTheme="minorHAnsi" w:cstheme="minorBidi"/>
           <w:noProof/>
-          <w:sz w:val="22"/>
-          <w:szCs w:val="22"/>
+          <w:kern w:val="2"/>
+          <w:sz w:val="24"/>
+          <w:szCs w:val="24"/>
           <w:lang w:val="de-AT" w:eastAsia="de-AT"/>
+          <w14:ligatures w14:val="standardContextual"/>
         </w:rPr>
         <w:tab/>
       </w:r>
       <w:r>
         <w:rPr>
-          <w:rFonts w:eastAsia="TimesNewRomanPSMT" w:cs="TimesNewRomanPSMT"/>
-          <w:noProof/>
-        </w:rPr>
-        <w:t>Diagramm</w:t>
+          <w:noProof/>
+        </w:rPr>
+        <w:t>Externe Referenzen</w:t>
       </w:r>
       <w:r>
         <w:rPr>
@@ -1108,7 +1715,7 @@
         <w:rPr>
           <w:noProof/>
         </w:rPr>
-        <w:instrText xml:space="preserve"> PAGEREF _Toc524250393 \h </w:instrText>
+        <w:instrText xml:space="preserve"> PAGEREF _Toc236315624 \h </w:instrText>
       </w:r>
       <w:r>
         <w:rPr>
@@ -1125,7 +1732,7 @@
         <w:rPr>
           <w:noProof/>
         </w:rPr>
-        <w:t>3</w:t>
+        <w:t>10</w:t>
       </w:r>
       <w:r>
         <w:rPr>
@@ -1144,34 +1751,36 @@
         <w:rPr>
           <w:rFonts w:asciiTheme="minorHAnsi" w:eastAsiaTheme="minorEastAsia" w:hAnsiTheme="minorHAnsi" w:cstheme="minorBidi"/>
           <w:noProof/>
-          <w:sz w:val="22"/>
-          <w:szCs w:val="22"/>
+          <w:kern w:val="2"/>
+          <w:sz w:val="24"/>
+          <w:szCs w:val="24"/>
           <w:lang w:val="de-AT" w:eastAsia="de-AT"/>
-        </w:rPr>
-      </w:pPr>
-      <w:r>
-        <w:rPr>
-          <w:rFonts w:eastAsia="TimesNewRomanPSMT" w:cs="TimesNewRomanPSMT"/>
-          <w:noProof/>
-        </w:rPr>
-        <w:t>2.7</w:t>
+          <w14:ligatures w14:val="standardContextual"/>
+        </w:rPr>
+      </w:pPr>
+      <w:r>
+        <w:rPr>
+          <w:noProof/>
+        </w:rPr>
+        <w:t>5.2</w:t>
       </w:r>
       <w:r>
         <w:rPr>
           <w:rFonts w:asciiTheme="minorHAnsi" w:eastAsiaTheme="minorEastAsia" w:hAnsiTheme="minorHAnsi" w:cstheme="minorBidi"/>
           <w:noProof/>
-          <w:sz w:val="22"/>
-          <w:szCs w:val="22"/>
+          <w:kern w:val="2"/>
+          <w:sz w:val="24"/>
+          <w:szCs w:val="24"/>
           <w:lang w:val="de-AT" w:eastAsia="de-AT"/>
+          <w14:ligatures w14:val="standardContextual"/>
         </w:rPr>
         <w:tab/>
       </w:r>
       <w:r>
         <w:rPr>
-          <w:rFonts w:eastAsia="TimesNewRomanPSMT" w:cs="TimesNewRomanPSMT"/>
-          <w:noProof/>
-        </w:rPr>
-        <w:t>Ergebnis</w:t>
+          <w:noProof/>
+        </w:rPr>
+        <w:t>Temp_drifft</w:t>
       </w:r>
       <w:r>
         <w:rPr>
@@ -1189,7 +1798,7 @@
         <w:rPr>
           <w:noProof/>
         </w:rPr>
-        <w:instrText xml:space="preserve"> PAGEREF _Toc524250394 \h </w:instrText>
+        <w:instrText xml:space="preserve"> PAGEREF _Toc236315625 \h </w:instrText>
       </w:r>
       <w:r>
         <w:rPr>
@@ -1206,7 +1815,173 @@
         <w:rPr>
           <w:noProof/>
         </w:rPr>
-        <w:t>3</w:t>
+        <w:t>10</w:t>
+      </w:r>
+      <w:r>
+        <w:rPr>
+          <w:noProof/>
+        </w:rPr>
+        <w:fldChar w:fldCharType="end"/>
+      </w:r>
+    </w:p>
+    <w:p>
+      <w:pPr>
+        <w:pStyle w:val="Verzeichnis2"/>
+        <w:tabs>
+          <w:tab w:val="left" w:pos="800"/>
+          <w:tab w:val="right" w:leader="dot" w:pos="9060"/>
+        </w:tabs>
+        <w:rPr>
+          <w:rFonts w:asciiTheme="minorHAnsi" w:eastAsiaTheme="minorEastAsia" w:hAnsiTheme="minorHAnsi" w:cstheme="minorBidi"/>
+          <w:noProof/>
+          <w:kern w:val="2"/>
+          <w:sz w:val="24"/>
+          <w:szCs w:val="24"/>
+          <w:lang w:val="de-AT" w:eastAsia="de-AT"/>
+          <w14:ligatures w14:val="standardContextual"/>
+        </w:rPr>
+      </w:pPr>
+      <w:r>
+        <w:rPr>
+          <w:noProof/>
+        </w:rPr>
+        <w:t>5.3</w:t>
+      </w:r>
+      <w:r>
+        <w:rPr>
+          <w:rFonts w:asciiTheme="minorHAnsi" w:eastAsiaTheme="minorEastAsia" w:hAnsiTheme="minorHAnsi" w:cstheme="minorBidi"/>
+          <w:noProof/>
+          <w:kern w:val="2"/>
+          <w:sz w:val="24"/>
+          <w:szCs w:val="24"/>
+          <w:lang w:val="de-AT" w:eastAsia="de-AT"/>
+          <w14:ligatures w14:val="standardContextual"/>
+        </w:rPr>
+        <w:tab/>
+      </w:r>
+      <w:r>
+        <w:rPr>
+          <w:noProof/>
+        </w:rPr>
+        <w:t>Sample rate</w:t>
+      </w:r>
+      <w:r>
+        <w:rPr>
+          <w:noProof/>
+        </w:rPr>
+        <w:tab/>
+      </w:r>
+      <w:r>
+        <w:rPr>
+          <w:noProof/>
+        </w:rPr>
+        <w:fldChar w:fldCharType="begin"/>
+      </w:r>
+      <w:r>
+        <w:rPr>
+          <w:noProof/>
+        </w:rPr>
+        <w:instrText xml:space="preserve"> PAGEREF _Toc236315626 \h </w:instrText>
+      </w:r>
+      <w:r>
+        <w:rPr>
+          <w:noProof/>
+        </w:rPr>
+      </w:r>
+      <w:r>
+        <w:rPr>
+          <w:noProof/>
+        </w:rPr>
+        <w:fldChar w:fldCharType="separate"/>
+      </w:r>
+      <w:r>
+        <w:rPr>
+          <w:noProof/>
+        </w:rPr>
+        <w:t>10</w:t>
+      </w:r>
+      <w:r>
+        <w:rPr>
+          <w:noProof/>
+        </w:rPr>
+        <w:fldChar w:fldCharType="end"/>
+      </w:r>
+    </w:p>
+    <w:p>
+      <w:pPr>
+        <w:pStyle w:val="Verzeichnis2"/>
+        <w:tabs>
+          <w:tab w:val="left" w:pos="800"/>
+          <w:tab w:val="right" w:leader="dot" w:pos="9060"/>
+        </w:tabs>
+        <w:rPr>
+          <w:rFonts w:asciiTheme="minorHAnsi" w:eastAsiaTheme="minorEastAsia" w:hAnsiTheme="minorHAnsi" w:cstheme="minorBidi"/>
+          <w:noProof/>
+          <w:kern w:val="2"/>
+          <w:sz w:val="24"/>
+          <w:szCs w:val="24"/>
+          <w:lang w:val="de-AT" w:eastAsia="de-AT"/>
+          <w14:ligatures w14:val="standardContextual"/>
+        </w:rPr>
+      </w:pPr>
+      <w:r>
+        <w:rPr>
+          <w:noProof/>
+        </w:rPr>
+        <w:t>5.4</w:t>
+      </w:r>
+      <w:r>
+        <w:rPr>
+          <w:rFonts w:asciiTheme="minorHAnsi" w:eastAsiaTheme="minorEastAsia" w:hAnsiTheme="minorHAnsi" w:cstheme="minorBidi"/>
+          <w:noProof/>
+          <w:kern w:val="2"/>
+          <w:sz w:val="24"/>
+          <w:szCs w:val="24"/>
+          <w:lang w:val="de-AT" w:eastAsia="de-AT"/>
+          <w14:ligatures w14:val="standardContextual"/>
+        </w:rPr>
+        <w:tab/>
+      </w:r>
+      <w:r>
+        <w:rPr>
+          <w:noProof/>
+        </w:rPr>
+        <w:t>Eingangsspannungsbereich</w:t>
+      </w:r>
+      <w:r>
+        <w:rPr>
+          <w:noProof/>
+        </w:rPr>
+        <w:tab/>
+      </w:r>
+      <w:r>
+        <w:rPr>
+          <w:noProof/>
+        </w:rPr>
+        <w:fldChar w:fldCharType="begin"/>
+      </w:r>
+      <w:r>
+        <w:rPr>
+          <w:noProof/>
+        </w:rPr>
+        <w:instrText xml:space="preserve"> PAGEREF _Toc236315627 \h </w:instrText>
+      </w:r>
+      <w:r>
+        <w:rPr>
+          <w:noProof/>
+        </w:rPr>
+      </w:r>
+      <w:r>
+        <w:rPr>
+          <w:noProof/>
+        </w:rPr>
+        <w:fldChar w:fldCharType="separate"/>
+      </w:r>
+      <w:r>
+        <w:rPr>
+          <w:noProof/>
+        </w:rPr>
+        <w:t>11</w:t>
       </w:r>
       <w:r>
         <w:rPr>
@@ -1225,32 +2000,38 @@
         <w:rPr>
           <w:rFonts w:asciiTheme="minorHAnsi" w:eastAsiaTheme="minorEastAsia" w:hAnsiTheme="minorHAnsi" w:cstheme="minorBidi"/>
           <w:noProof/>
-          <w:sz w:val="22"/>
-          <w:szCs w:val="22"/>
+          <w:kern w:val="2"/>
+          <w:sz w:val="24"/>
+          <w:szCs w:val="24"/>
           <w:lang w:val="de-AT" w:eastAsia="de-AT"/>
-        </w:rPr>
-      </w:pPr>
-      <w:r>
-        <w:rPr>
-          <w:noProof/>
-        </w:rPr>
-        <w:t>3</w:t>
+          <w14:ligatures w14:val="standardContextual"/>
+        </w:rPr>
+      </w:pPr>
+      <w:r>
+        <w:rPr>
+          <w:noProof/>
+          <w:lang w:val="de-AT"/>
+        </w:rPr>
+        <w:t>6</w:t>
       </w:r>
       <w:r>
         <w:rPr>
           <w:rFonts w:asciiTheme="minorHAnsi" w:eastAsiaTheme="minorEastAsia" w:hAnsiTheme="minorHAnsi" w:cstheme="minorBidi"/>
           <w:noProof/>
-          <w:sz w:val="22"/>
-          <w:szCs w:val="22"/>
+          <w:kern w:val="2"/>
+          <w:sz w:val="24"/>
+          <w:szCs w:val="24"/>
           <w:lang w:val="de-AT" w:eastAsia="de-AT"/>
+          <w14:ligatures w14:val="standardContextual"/>
         </w:rPr>
         <w:tab/>
       </w:r>
       <w:r>
         <w:rPr>
           <w:noProof/>
-        </w:rPr>
-        <w:t>Abschließende Bemerkungen</w:t>
+          <w:lang w:val="de-AT"/>
+        </w:rPr>
+        <w:t>OPVs</w:t>
       </w:r>
       <w:r>
         <w:rPr>
@@ -1268,7 +2049,7 @@
         <w:rPr>
           <w:noProof/>
         </w:rPr>
-        <w:instrText xml:space="preserve"> PAGEREF _Toc524250395 \h </w:instrText>
+        <w:instrText xml:space="preserve"> PAGEREF _Toc236315628 \h </w:instrText>
       </w:r>
       <w:r>
         <w:rPr>
@@ -1285,7 +2066,7 @@
         <w:rPr>
           <w:noProof/>
         </w:rPr>
-        <w:t>3</w:t>
+        <w:t>11</w:t>
       </w:r>
       <w:r>
         <w:rPr>
@@ -1304,24 +2085,28 @@
         <w:rPr>
           <w:rFonts w:asciiTheme="minorHAnsi" w:eastAsiaTheme="minorEastAsia" w:hAnsiTheme="minorHAnsi" w:cstheme="minorBidi"/>
           <w:noProof/>
-          <w:sz w:val="22"/>
-          <w:szCs w:val="22"/>
+          <w:kern w:val="2"/>
+          <w:sz w:val="24"/>
+          <w:szCs w:val="24"/>
           <w:lang w:val="de-AT" w:eastAsia="de-AT"/>
-        </w:rPr>
-      </w:pPr>
-      <w:r>
-        <w:rPr>
-          <w:noProof/>
-        </w:rPr>
-        <w:t>4</w:t>
+          <w14:ligatures w14:val="standardContextual"/>
+        </w:rPr>
+      </w:pPr>
+      <w:r>
+        <w:rPr>
+          <w:noProof/>
+        </w:rPr>
+        <w:t>7</w:t>
       </w:r>
       <w:r>
         <w:rPr>
           <w:rFonts w:asciiTheme="minorHAnsi" w:eastAsiaTheme="minorEastAsia" w:hAnsiTheme="minorHAnsi" w:cstheme="minorBidi"/>
           <w:noProof/>
-          <w:sz w:val="22"/>
-          <w:szCs w:val="22"/>
+          <w:kern w:val="2"/>
+          <w:sz w:val="24"/>
+          <w:szCs w:val="24"/>
           <w:lang w:val="de-AT" w:eastAsia="de-AT"/>
+          <w14:ligatures w14:val="standardContextual"/>
         </w:rPr>
         <w:tab/>
       </w:r>
@@ -1329,6 +2114,89 @@
         <w:rPr>
           <w:noProof/>
         </w:rPr>
+        <w:t>Abschließende Bemerkungen</w:t>
+      </w:r>
+      <w:r>
+        <w:rPr>
+          <w:noProof/>
+        </w:rPr>
+        <w:tab/>
+      </w:r>
+      <w:r>
+        <w:rPr>
+          <w:noProof/>
+        </w:rPr>
+        <w:fldChar w:fldCharType="begin"/>
+      </w:r>
+      <w:r>
+        <w:rPr>
+          <w:noProof/>
+        </w:rPr>
+        <w:instrText xml:space="preserve"> PAGEREF _Toc236315629 \h </w:instrText>
+      </w:r>
+      <w:r>
+        <w:rPr>
+          <w:noProof/>
+        </w:rPr>
+      </w:r>
+      <w:r>
+        <w:rPr>
+          <w:noProof/>
+        </w:rPr>
+        <w:fldChar w:fldCharType="separate"/>
+      </w:r>
+      <w:r>
+        <w:rPr>
+          <w:noProof/>
+        </w:rPr>
+        <w:t>12</w:t>
+      </w:r>
+      <w:r>
+        <w:rPr>
+          <w:noProof/>
+        </w:rPr>
+        <w:fldChar w:fldCharType="end"/>
+      </w:r>
+    </w:p>
+    <w:p>
+      <w:pPr>
+        <w:pStyle w:val="Verzeichnis1"/>
+        <w:tabs>
+          <w:tab w:val="left" w:pos="400"/>
+          <w:tab w:val="right" w:leader="dot" w:pos="9060"/>
+        </w:tabs>
+        <w:rPr>
+          <w:rFonts w:asciiTheme="minorHAnsi" w:eastAsiaTheme="minorEastAsia" w:hAnsiTheme="minorHAnsi" w:cstheme="minorBidi"/>
+          <w:noProof/>
+          <w:kern w:val="2"/>
+          <w:sz w:val="24"/>
+          <w:szCs w:val="24"/>
+          <w:lang w:val="de-AT" w:eastAsia="de-AT"/>
+          <w14:ligatures w14:val="standardContextual"/>
+        </w:rPr>
+      </w:pPr>
+      <w:r>
+        <w:rPr>
+          <w:noProof/>
+        </w:rPr>
+        <w:t>8</w:t>
+      </w:r>
+      <w:r>
+        <w:rPr>
+          <w:rFonts w:asciiTheme="minorHAnsi" w:eastAsiaTheme="minorEastAsia" w:hAnsiTheme="minorHAnsi" w:cstheme="minorBidi"/>
+          <w:noProof/>
+          <w:kern w:val="2"/>
+          <w:sz w:val="24"/>
+          <w:szCs w:val="24"/>
+          <w:lang w:val="de-AT" w:eastAsia="de-AT"/>
+          <w14:ligatures w14:val="standardContextual"/>
+        </w:rPr>
+        <w:tab/>
+      </w:r>
+      <w:r>
+        <w:rPr>
+          <w:noProof/>
+        </w:rPr>
         <w:t>Inventarliste</w:t>
       </w:r>
       <w:r>
@@ -1347,7 +2215,7 @@
         <w:rPr>
           <w:noProof/>
         </w:rPr>
-        <w:instrText xml:space="preserve"> PAGEREF _Toc524250396 \h </w:instrText>
+        <w:instrText xml:space="preserve"> PAGEREF _Toc236315630 \h </w:instrText>
       </w:r>
       <w:r>
         <w:rPr>
@@ -1364,7 +2232,7 @@
         <w:rPr>
           <w:noProof/>
         </w:rPr>
-        <w:t>3</w:t>
+        <w:t>12</w:t>
       </w:r>
       <w:r>
         <w:rPr>
@@ -1405,10 +2273,12 @@
         <w:pStyle w:val="berschrift1"/>
         <w:pageBreakBefore/>
       </w:pPr>
+      <w:bookmarkStart w:id="0" w:name="_Toc236315610"/>
       <w:r>
         <w:lastRenderedPageBreak/>
         <w:t>Begriffsdefinition</w:t>
       </w:r>
+      <w:bookmarkEnd w:id="0"/>
     </w:p>
     <w:p>
       <w:pPr>
@@ -1910,10 +2780,12 @@
       <w:pPr>
         <w:pStyle w:val="berschrift1"/>
       </w:pPr>
+      <w:bookmarkStart w:id="1" w:name="_Toc236315611"/>
       <w:r>
         <w:lastRenderedPageBreak/>
         <w:t>Theorie der Arbeit</w:t>
       </w:r>
+      <w:bookmarkEnd w:id="1"/>
       <w:r>
         <w:t xml:space="preserve"> </w:t>
       </w:r>
@@ -1925,12 +2797,14 @@
           <w:rFonts w:eastAsia="TimesNewRomanPSMT"/>
         </w:rPr>
       </w:pPr>
+      <w:bookmarkStart w:id="2" w:name="_Toc236315612"/>
       <w:r>
         <w:rPr>
           <w:rFonts w:eastAsia="TimesNewRomanPSMT"/>
         </w:rPr>
         <w:t>Grundlagen von Feldeffekttransistoren</w:t>
       </w:r>
+      <w:bookmarkEnd w:id="2"/>
     </w:p>
     <w:p>
       <w:pPr>
@@ -2187,9 +3061,11 @@
       <w:pPr>
         <w:pStyle w:val="berschrift1"/>
       </w:pPr>
+      <w:bookmarkStart w:id="3" w:name="_Toc236315613"/>
       <w:r>
         <w:t>Grundlage der MOSFET Vermessung</w:t>
       </w:r>
+      <w:bookmarkEnd w:id="3"/>
     </w:p>
     <w:p>
       <w:pPr>
@@ -2200,6 +3076,7 @@
           <w:szCs w:val="26"/>
         </w:rPr>
       </w:pPr>
+      <w:bookmarkStart w:id="4" w:name="_Toc236315614"/>
       <w:r>
         <w:rPr>
           <w:b w:val="0"/>
@@ -2208,6 +3085,7 @@
         </w:rPr>
         <w:t>MOSFET Parameter</w:t>
       </w:r>
+      <w:bookmarkEnd w:id="4"/>
     </w:p>
     <w:p>
       <w:pPr>
@@ -2268,6 +3146,7 @@
           <w:szCs w:val="26"/>
         </w:rPr>
       </w:pPr>
+      <w:bookmarkStart w:id="5" w:name="_Toc236315615"/>
       <w:r>
         <w:rPr>
           <w:rFonts w:eastAsia="TimesNewRomanPSMT" w:cs="TimesNewRomanPSMT"/>
@@ -2277,6 +3156,7 @@
         </w:rPr>
         <w:t>Messung von MOSFET Parameter</w:t>
       </w:r>
+      <w:bookmarkEnd w:id="5"/>
     </w:p>
     <w:p>
       <w:r>
@@ -2326,9 +3206,11 @@
       <w:pPr>
         <w:pStyle w:val="berschrift2"/>
       </w:pPr>
+      <w:bookmarkStart w:id="6" w:name="_Toc236315616"/>
       <w:r>
         <w:t>Messungsaufbau</w:t>
       </w:r>
+      <w:bookmarkEnd w:id="6"/>
     </w:p>
     <w:p>
       <w:r>
@@ -2726,9 +3608,11 @@
       <w:pPr>
         <w:pStyle w:val="berschrift3"/>
       </w:pPr>
+      <w:bookmarkStart w:id="7" w:name="_Toc236315617"/>
       <w:r>
         <w:t>Grenzfrequenz</w:t>
       </w:r>
+      <w:bookmarkEnd w:id="7"/>
     </w:p>
     <w:p>
       <w:r>
@@ -2737,6 +3621,9 @@
     </w:p>
     <w:p>
       <w:r>
+        <w:rPr>
+          <w:noProof/>
+        </w:rPr>
         <w:drawing>
           <wp:inline distT="0" distB="0" distL="0" distR="0" wp14:anchorId="4B0E9541" wp14:editId="5ECB0158">
             <wp:extent cx="2505045" cy="1600200"/>
@@ -2796,6 +3683,9 @@
     </w:p>
     <w:p>
       <w:r>
+        <w:rPr>
+          <w:noProof/>
+        </w:rPr>
         <w:drawing>
           <wp:inline distT="0" distB="0" distL="0" distR="0" wp14:anchorId="35DB711F" wp14:editId="3B77536C">
             <wp:extent cx="5937874" cy="2300288"/>
@@ -2851,9 +3741,11 @@
       <w:pPr>
         <w:pStyle w:val="berschrift3"/>
       </w:pPr>
+      <w:bookmarkStart w:id="8" w:name="_Toc236315618"/>
       <w:r>
         <w:t>Thermisches Rauschen</w:t>
       </w:r>
+      <w:bookmarkEnd w:id="8"/>
     </w:p>
     <w:p>
       <w:r>
@@ -4179,13 +5071,12 @@
         </w:tc>
       </w:tr>
     </w:tbl>
-    <w:p>
-      <w:bookmarkStart w:id="0" w:name="_Toc524250395"/>
-    </w:p>
+    <w:p/>
     <w:p>
       <w:pPr>
         <w:pStyle w:val="berschrift1"/>
       </w:pPr>
+      <w:bookmarkStart w:id="9" w:name="_Toc236315619"/>
       <w:r>
         <w:t>Schaltung</w:t>
       </w:r>
@@ -4195,6 +5086,7 @@
       <w:r>
         <w:t>erstellung Blockdiagramm</w:t>
       </w:r>
+      <w:bookmarkEnd w:id="9"/>
     </w:p>
     <w:p/>
     <w:p>
@@ -4252,9 +5144,11 @@
       <w:pPr>
         <w:pStyle w:val="berschrift2"/>
       </w:pPr>
+      <w:bookmarkStart w:id="10" w:name="_Toc236315620"/>
       <w:r>
         <w:t>Spannungsversorgung</w:t>
       </w:r>
+      <w:bookmarkEnd w:id="10"/>
     </w:p>
     <w:p>
       <w:r>
@@ -4305,12 +5199,17 @@
       <w:pPr>
         <w:pStyle w:val="berschrift3"/>
       </w:pPr>
+      <w:bookmarkStart w:id="11" w:name="_Toc236315621"/>
       <w:r>
         <w:t>LT3042</w:t>
       </w:r>
-    </w:p>
-    <w:p>
-      <w:r>
+      <w:bookmarkEnd w:id="11"/>
+    </w:p>
+    <w:p>
+      <w:r>
+        <w:rPr>
+          <w:noProof/>
+        </w:rPr>
         <w:drawing>
           <wp:inline distT="0" distB="0" distL="0" distR="0" wp14:anchorId="5B6DDBF1" wp14:editId="327E7AED">
             <wp:extent cx="5759450" cy="2851150"/>
@@ -4358,6 +5257,9 @@
     </w:p>
     <w:p>
       <w:r>
+        <w:rPr>
+          <w:noProof/>
+        </w:rPr>
         <w:drawing>
           <wp:inline distT="0" distB="0" distL="0" distR="0" wp14:anchorId="1F3310D5" wp14:editId="05198BEE">
             <wp:extent cx="3429000" cy="1226614"/>
@@ -4417,12 +5319,75 @@
         <w:t>spannung ein, wenn die spannung am PGFB pin über 0,3V steigt wird der PIN PG Auf 0V gezogen mittels einem Open Collectoe ausgangs</w:t>
       </w:r>
       <w:r>
-        <w:t>, wenn die PGFB und PG funktion nicht gebracuht wird kann PGFB auf 0V gelegt werden kann und PG Floating gelassen wird</w:t>
-      </w:r>
-      <w:r>
+        <w:t xml:space="preserve">, </w:t>
+      </w:r>
+      <w:r>
+        <w:rPr>
+          <w:highlight w:val="yellow"/>
+        </w:rPr>
+        <w:t>wenn die PGFB und PG funktion nicht gebracuht wird kann PGFB auf 0V gelegt werden kann und PG Floating gelassen wird</w:t>
+      </w:r>
+      <w:r>
+        <w:rPr>
+          <w:highlight w:val="yellow"/>
+        </w:rPr>
         <w:t>.</w:t>
       </w:r>
-    </w:p>
+      <w:r>
+        <w:t xml:space="preserve"> </w:t>
+      </w:r>
+      <w:r>
+        <w:rPr>
+          <w:highlight w:val="red"/>
+        </w:rPr>
+        <w:t>Das ist Falsch fehl funktion wenn auf 0V gezogen, eher auf Vin ziehen.</w:t>
+      </w:r>
+    </w:p>
+    <w:p/>
+    <w:p>
+      <w:r>
+        <w:rPr>
+          <w:noProof/>
+        </w:rPr>
+        <w:lastRenderedPageBreak/>
+        <w:drawing>
+          <wp:inline distT="0" distB="0" distL="0" distR="0" wp14:anchorId="31BA331F" wp14:editId="4F47F637">
+            <wp:extent cx="4991533" cy="4419983"/>
+            <wp:effectExtent l="0" t="0" r="0" b="0"/>
+            <wp:docPr id="1635705731" name="Grafik 1"/>
+            <wp:cNvGraphicFramePr>
+              <a:graphicFrameLocks xmlns:a="http://schemas.openxmlformats.org/drawingml/2006/main" noChangeAspect="1"/>
+            </wp:cNvGraphicFramePr>
+            <a:graphic xmlns:a="http://schemas.openxmlformats.org/drawingml/2006/main">
+              <a:graphicData uri="http://schemas.openxmlformats.org/drawingml/2006/picture">
+                <pic:pic xmlns:pic="http://schemas.openxmlformats.org/drawingml/2006/picture">
+                  <pic:nvPicPr>
+                    <pic:cNvPr id="1635705731" name=""/>
+                    <pic:cNvPicPr/>
+                  </pic:nvPicPr>
+                  <pic:blipFill>
+                    <a:blip r:embed="rId19"/>
+                    <a:stretch>
+                      <a:fillRect/>
+                    </a:stretch>
+                  </pic:blipFill>
+                  <pic:spPr>
+                    <a:xfrm>
+                      <a:off x="0" y="0"/>
+                      <a:ext cx="4991533" cy="4419983"/>
+                    </a:xfrm>
+                    <a:prstGeom prst="rect">
+                      <a:avLst/>
+                    </a:prstGeom>
+                  </pic:spPr>
+                </pic:pic>
+              </a:graphicData>
+            </a:graphic>
+          </wp:inline>
+        </w:drawing>
+      </w:r>
+    </w:p>
+    <w:p/>
     <w:p>
       <w:r>
         <w:t>Die selben eigenschaften gelten für LT3094.</w:t>
@@ -4439,10 +5404,11 @@
       <w:pPr>
         <w:pStyle w:val="berschrift3"/>
       </w:pPr>
-      <w:r>
-        <w:lastRenderedPageBreak/>
+      <w:bookmarkStart w:id="12" w:name="_Toc236315622"/>
+      <w:r>
         <w:t>TLV76733</w:t>
       </w:r>
+      <w:bookmarkEnd w:id="12"/>
     </w:p>
     <w:p>
       <w:r>
@@ -4467,7 +5433,7 @@
                     </pic:cNvPicPr>
                   </pic:nvPicPr>
                   <pic:blipFill rotWithShape="1">
-                    <a:blip r:embed="rId19">
+                    <a:blip r:embed="rId20">
                       <a:extLst>
                         <a:ext uri="{28A0092B-C50C-407E-A947-70E740481C1C}">
                           <a14:useLocalDpi xmlns:a14="http://schemas.microsoft.com/office/drawing/2010/main" val="0"/>
@@ -4508,15 +5474,803 @@
       <w:r>
         <w:t>Mit dem EN PIN kann die 3,3V Output angeschalten werden.</w:t>
       </w:r>
-    </w:p>
+      <w:r>
+        <w:t xml:space="preserve"> dieser ic kann einen ausgangsstrom von 500mA liefern, dies wird für die ansteuerung der relais gebraucht.</w:t>
+      </w:r>
+    </w:p>
+    <w:p/>
     <w:p>
       <w:pPr>
         <w:pStyle w:val="berschrift1"/>
       </w:pPr>
       <w:r>
+        <w:t xml:space="preserve"> </w:t>
+      </w:r>
+      <w:bookmarkStart w:id="13" w:name="_Toc236315623"/>
+      <w:r>
+        <w:t>ADC</w:t>
+      </w:r>
+      <w:bookmarkEnd w:id="13"/>
+    </w:p>
+    <w:p>
+      <w:pPr>
+        <w:rPr>
+          <w:noProof/>
+        </w:rPr>
+      </w:pPr>
+      <w:r>
+        <w:t>Als adc wird der ADS8681 vorerst verwendet, doch da in der entwikluing der Platine</w:t>
+      </w:r>
+      <w:r>
+        <w:t xml:space="preserve"> viele kommunikations probleme aufgetreten sind, in zwischen zeit da keine einstellung auf dem ads8681 </w:t>
+      </w:r>
+      <w:r>
+        <w:lastRenderedPageBreak/>
+        <w:t>vorgenommen werden kann wird die standart einstellung verwendet.</w:t>
+      </w:r>
+      <w:r>
+        <w:rPr>
+          <w:noProof/>
+        </w:rPr>
+        <w:t xml:space="preserve"> </w:t>
+      </w:r>
+      <w:r>
+        <w:rPr>
+          <w:noProof/>
+        </w:rPr>
+        <w:drawing>
+          <wp:inline distT="0" distB="0" distL="0" distR="0" wp14:anchorId="5BF8E75A" wp14:editId="5F5172F0">
+            <wp:extent cx="5759450" cy="2508250"/>
+            <wp:effectExtent l="0" t="0" r="0" b="6350"/>
+            <wp:docPr id="2134504054" name="Grafik 1"/>
+            <wp:cNvGraphicFramePr>
+              <a:graphicFrameLocks xmlns:a="http://schemas.openxmlformats.org/drawingml/2006/main" noChangeAspect="1"/>
+            </wp:cNvGraphicFramePr>
+            <a:graphic xmlns:a="http://schemas.openxmlformats.org/drawingml/2006/main">
+              <a:graphicData uri="http://schemas.openxmlformats.org/drawingml/2006/picture">
+                <pic:pic xmlns:pic="http://schemas.openxmlformats.org/drawingml/2006/picture">
+                  <pic:nvPicPr>
+                    <pic:cNvPr id="2134504054" name=""/>
+                    <pic:cNvPicPr/>
+                  </pic:nvPicPr>
+                  <pic:blipFill>
+                    <a:blip r:embed="rId21"/>
+                    <a:stretch>
+                      <a:fillRect/>
+                    </a:stretch>
+                  </pic:blipFill>
+                  <pic:spPr>
+                    <a:xfrm>
+                      <a:off x="0" y="0"/>
+                      <a:ext cx="5759450" cy="2508250"/>
+                    </a:xfrm>
+                    <a:prstGeom prst="rect">
+                      <a:avLst/>
+                    </a:prstGeom>
+                  </pic:spPr>
+                </pic:pic>
+              </a:graphicData>
+            </a:graphic>
+          </wp:inline>
+        </w:drawing>
+      </w:r>
+    </w:p>
+    <w:p>
+      <w:pPr>
+        <w:rPr>
+          <w:noProof/>
+        </w:rPr>
+      </w:pPr>
+      <w:r>
+        <w:rPr>
+          <w:noProof/>
+        </w:rPr>
+        <w:t>Bei einem ADS8681 kann intern umgeschalten werden zwischen der internen Referenz welche natürlich nicht die langezit stabilitär als auch temperat stabilität einer externen hat.</w:t>
+      </w:r>
+    </w:p>
+    <w:p>
+      <w:pPr>
+        <w:rPr>
+          <w:noProof/>
+        </w:rPr>
+      </w:pPr>
+      <w:r>
+        <w:rPr>
+          <w:noProof/>
+        </w:rPr>
+        <w:t>Anzudenken ist eine externe referenz auf der platine einzubauen um abgleiche zu treffen, von einer stabielen refernez z.b. LM399, ADR1000 oder ADR1001. Diese referenzen sind temperatur stabiel also beheizt, dies verbessert die stabilitär als auch sind diese referenzen extrem langzeit stabil unter 1 ppm / jahr.</w:t>
+      </w:r>
+    </w:p>
+    <w:p>
+      <w:pPr>
+        <w:pStyle w:val="berschrift2"/>
+      </w:pPr>
+      <w:bookmarkStart w:id="14" w:name="_Toc236315624"/>
+      <w:r>
+        <w:t xml:space="preserve">Externe </w:t>
+      </w:r>
+      <w:r>
+        <w:t>Referenzen</w:t>
+      </w:r>
+      <w:bookmarkEnd w:id="14"/>
+    </w:p>
+    <w:p>
+      <w:r>
+        <w:t>Diese refernezn haben eine hohe initerial abweichung vom soll wert, dieser wert muss nachgemessen werden von diesem können die refferenzen z.b. 4.096V abgeleitet werden. anders können auch nicht beheizte referenzen verwendet werden z.b. ADR4540 welche eine refenz von 4.096V. doch diese sind wie gesagt nicht beheizt und beiten deshalb nicht die gleiche temperatur und lagzeit stablität von unter 1 ppm/a bei diesen ist von einem drift von &gt;10ppm/a zu rechnen.</w:t>
+      </w:r>
+    </w:p>
+    <w:p>
+      <w:r>
+        <w:t xml:space="preserve">Ein großer fall warum das einbauen von diesen ist das diese um die langzeit stabilitä zu bestitzen müssendise dauer bestromt sein allein durch einmalges ausschalten der versorgung kann zu einer änderung und dauerhafter änderung der stabilität von mehreren ppm führt. </w:t>
+      </w:r>
+    </w:p>
+    <w:p>
+      <w:r>
+        <w:t>Das bedeutet das ein ausfall freie versorgung gewärleistet werden muss z.b. entweder eine netztversorgung und nothaber eine akku versorgung doch ein anschluss a</w:t>
+      </w:r>
+      <w:r>
+        <w:t xml:space="preserve">n das netz das mann wieder ein 50hz brummen hat. Doch dies kann auch wieder durch z.bn. wie die verwednetern ldos verwednen. </w:t>
+      </w:r>
+    </w:p>
+    <w:p>
+      <w:r>
+        <w:t>Generell rachen soche refenzen viel platz auf der leiterplatte meist bnracuhen eine gesamte eruo card(100mm*160mm).</w:t>
+      </w:r>
+    </w:p>
+    <w:p>
+      <w:pPr>
+        <w:pStyle w:val="berschrift2"/>
+      </w:pPr>
+      <w:bookmarkStart w:id="15" w:name="_Toc236315625"/>
+      <w:r>
+        <w:t>Temp_drifft</w:t>
+      </w:r>
+      <w:bookmarkEnd w:id="15"/>
+    </w:p>
+    <w:p>
+      <w:r>
+        <w:t xml:space="preserve">Auch die vorverstärker stufe des ADC und der internen DAC(da es ein SAR ist) </w:t>
+      </w:r>
+      <w:r>
+        <w:t>haben einen temperatur dirft, deswegen ist es wichtig bei gleichbleibender temperatur zu messen. Deswegen muss vor einer messung „gewartet“ werden biss alle bauteile auf betriebs temperatur sind auch Thermal equilibrium, dies bedeutet das das gerät warmgelaufen ist bis zu der temperatur in welcher die abgegebene wärme energie gleich der abgegebene wärme energie ist.</w:t>
+      </w:r>
+    </w:p>
+    <w:p>
+      <w:pPr>
+        <w:pStyle w:val="berschrift2"/>
+      </w:pPr>
+      <w:bookmarkStart w:id="16" w:name="_Toc236315626"/>
+      <w:r>
+        <w:t>Sample rate</w:t>
+      </w:r>
+      <w:bookmarkEnd w:id="16"/>
+    </w:p>
+    <w:p>
+      <w:r>
+        <w:t>Da Phänomne untersucht werden wollen die in einem bereich von wenigen us bis wenigen ms auftreten</w:t>
+      </w:r>
+      <w:r>
+        <w:t xml:space="preserve">, deshalb wurde angenommen das bei einem phänomehen von 10us mindestens 10 sampels </w:t>
+      </w:r>
+      <w:r>
+        <w:lastRenderedPageBreak/>
+        <w:t>genommen werden wollen um es genügent aufzuzeichnen zu können wurde eine mindest samplerate von 100kHz angelegt.</w:t>
+      </w:r>
+    </w:p>
+    <w:p/>
+    <w:p>
+      <w:pPr>
+        <w:pStyle w:val="berschrift2"/>
+      </w:pPr>
+      <w:bookmarkStart w:id="17" w:name="_Toc236315627"/>
+      <w:r>
+        <w:t>Eingangsspannungsbereich</w:t>
+      </w:r>
+      <w:bookmarkEnd w:id="17"/>
+    </w:p>
+    <w:p>
+      <w:r>
+        <w:t>Beim ADS8681 ist der eingangsspannungsbereich programmierbar von:</w:t>
+      </w:r>
+    </w:p>
+    <w:p>
+      <w:pPr>
+        <w:rPr>
+          <w:lang w:val="en-GB"/>
+        </w:rPr>
+      </w:pPr>
+      <w:r>
+        <w:rPr>
+          <w:lang w:val="en-GB"/>
+        </w:rPr>
+        <w:t>/*</w:t>
+      </w:r>
+      <w:r>
+        <w:rPr>
+          <w:lang w:val="en-GB"/>
+        </w:rPr>
+        <w:t xml:space="preserve"> = ±3 × VREF */</w:t>
+      </w:r>
+    </w:p>
+    <w:p>
+      <w:pPr>
+        <w:rPr>
+          <w:lang w:val="en-GB"/>
+        </w:rPr>
+      </w:pPr>
+      <w:r>
+        <w:rPr>
+          <w:lang w:val="en-GB"/>
+        </w:rPr>
+        <w:t>/* = ±2.5 × VREF */</w:t>
+      </w:r>
+    </w:p>
+    <w:p>
+      <w:pPr>
+        <w:rPr>
+          <w:lang w:val="en-GB"/>
+        </w:rPr>
+      </w:pPr>
+      <w:r>
+        <w:rPr>
+          <w:lang w:val="en-GB"/>
+        </w:rPr>
+        <w:t>/* = ±1.5 × VREF */</w:t>
+      </w:r>
+    </w:p>
+    <w:p>
+      <w:pPr>
+        <w:rPr>
+          <w:lang w:val="en-GB"/>
+        </w:rPr>
+      </w:pPr>
+      <w:r>
+        <w:rPr>
+          <w:lang w:val="en-GB"/>
+        </w:rPr>
+        <w:t>/* = ±1.25 × VREF */</w:t>
+      </w:r>
+    </w:p>
+    <w:p>
+      <w:pPr>
+        <w:rPr>
+          <w:lang w:val="en-GB"/>
+        </w:rPr>
+      </w:pPr>
+      <w:r>
+        <w:rPr>
+          <w:lang w:val="en-GB"/>
+        </w:rPr>
+        <w:t>/* = ±0.625 × VREF */</w:t>
+      </w:r>
+    </w:p>
+    <w:p>
+      <w:pPr>
+        <w:rPr>
+          <w:lang w:val="en-GB"/>
+        </w:rPr>
+      </w:pPr>
+      <w:r>
+        <w:rPr>
+          <w:lang w:val="en-GB"/>
+        </w:rPr>
+        <w:t>/* = 3 × VREF */</w:t>
+      </w:r>
+    </w:p>
+    <w:p>
+      <w:pPr>
+        <w:rPr>
+          <w:lang w:val="en-GB"/>
+        </w:rPr>
+      </w:pPr>
+      <w:r>
+        <w:rPr>
+          <w:lang w:val="en-GB"/>
+        </w:rPr>
+        <w:t>/* = 2.5 × VREF */</w:t>
+      </w:r>
+    </w:p>
+    <w:p>
+      <w:pPr>
+        <w:rPr>
+          <w:lang w:val="en-GB"/>
+        </w:rPr>
+      </w:pPr>
+      <w:r>
+        <w:rPr>
+          <w:lang w:val="en-GB"/>
+        </w:rPr>
+        <w:t>/* = 1.5 × VREF */</w:t>
+      </w:r>
+    </w:p>
+    <w:p>
+      <w:pPr>
+        <w:rPr>
+          <w:lang w:val="en-GB"/>
+        </w:rPr>
+      </w:pPr>
+      <w:r>
+        <w:rPr>
+          <w:lang w:val="en-GB"/>
+        </w:rPr>
+        <w:t>/* = 1.25 × VREF */</w:t>
+      </w:r>
+    </w:p>
+    <w:p>
+      <w:pPr>
+        <w:rPr>
+          <w:lang w:val="de-AT"/>
+        </w:rPr>
+      </w:pPr>
+      <w:r>
+        <w:rPr>
+          <w:lang w:val="de-AT"/>
+        </w:rPr>
+        <w:t>Das ist eine nützliche f</w:t>
+      </w:r>
+      <w:r>
+        <w:rPr>
+          <w:lang w:val="de-AT"/>
+        </w:rPr>
+        <w:t>unktion bei einem messystem bei dem sich die range des messsignal sich ändert. Dies wäre praktisch doch wird nicht unbedingt benötigt. Da bei der test platine ein problem mit der kommunikation ADC konnte der eingangsbereich nicht umgestellt werden.</w:t>
+      </w:r>
+    </w:p>
+    <w:p>
+      <w:pPr>
+        <w:rPr>
+          <w:lang w:val="de-AT"/>
+        </w:rPr>
+      </w:pPr>
+    </w:p>
+    <w:p>
+      <w:pPr>
+        <w:rPr>
+          <w:lang w:val="de-AT"/>
+        </w:rPr>
+      </w:pPr>
+      <w:r>
+        <w:rPr>
+          <w:lang w:val="de-AT"/>
+        </w:rPr>
+        <w:t>Um die range des TIA auf den fixewn eingangssapnnungsbereich zu bringen wurde ein inverterender verstärker verwendet. Da die range auf die einstellung Vref*1,25 vorgesehen war wurde eine dämpfung von 0.333 eingebaut. Denn vom TIA (wenn ein Rail to Rail) die versorgung wurde mit +-8V ausgelegt, kommt es zu 8V*0.333=</w:t>
+      </w:r>
+      <w:r>
+        <w:rPr>
+          <w:lang w:val="de-AT"/>
+        </w:rPr>
+        <w:t>2,663V.  doch da die standart einstellung +-0,625*VREF=+-2,56V dies bedeutet da der TIA opv kein rail to rail ist also es ie zu einer 8V ausgangsspannung kommt geht sich der bereich aus. Doch wird nur ein positives signal erweartet dswegen wird die hälfte der range versoren.</w:t>
+      </w:r>
+    </w:p>
+    <w:p>
+      <w:pPr>
+        <w:rPr>
+          <w:lang w:val="de-AT"/>
+        </w:rPr>
+      </w:pPr>
+    </w:p>
+    <w:p>
+      <w:pPr>
+        <w:pStyle w:val="berschrift2"/>
+        <w:rPr>
+          <w:lang w:val="de-AT"/>
+        </w:rPr>
+      </w:pPr>
+      <w:r>
+        <w:rPr>
+          <w:lang w:val="de-AT"/>
+        </w:rPr>
+        <w:t>ADS8681 Schaltung</w:t>
+      </w:r>
+    </w:p>
+    <w:p>
+      <w:pPr>
+        <w:rPr>
+          <w:lang w:val="de-AT"/>
+        </w:rPr>
+      </w:pPr>
+      <w:r>
+        <w:rPr>
+          <w:noProof/>
+          <w:lang w:val="de-AT"/>
+        </w:rPr>
+        <w:drawing>
+          <wp:inline distT="0" distB="0" distL="0" distR="0" wp14:anchorId="047779E8" wp14:editId="7DD1CD53">
+            <wp:extent cx="5416008" cy="1967753"/>
+            <wp:effectExtent l="0" t="0" r="0" b="0"/>
+            <wp:docPr id="1249943001" name="Grafik 1"/>
+            <wp:cNvGraphicFramePr>
+              <a:graphicFrameLocks xmlns:a="http://schemas.openxmlformats.org/drawingml/2006/main" noChangeAspect="1"/>
+            </wp:cNvGraphicFramePr>
+            <a:graphic xmlns:a="http://schemas.openxmlformats.org/drawingml/2006/main">
+              <a:graphicData uri="http://schemas.openxmlformats.org/drawingml/2006/picture">
+                <pic:pic xmlns:pic="http://schemas.openxmlformats.org/drawingml/2006/picture">
+                  <pic:nvPicPr>
+                    <pic:cNvPr id="0" name="Picture 1"/>
+                    <pic:cNvPicPr>
+                      <a:picLocks noChangeAspect="1" noChangeArrowheads="1"/>
+                    </pic:cNvPicPr>
+                  </pic:nvPicPr>
+                  <pic:blipFill rotWithShape="1">
+                    <a:blip r:embed="rId22">
+                      <a:extLst>
+                        <a:ext uri="{28A0092B-C50C-407E-A947-70E740481C1C}">
+                          <a14:useLocalDpi xmlns:a14="http://schemas.microsoft.com/office/drawing/2010/main" val="0"/>
+                        </a:ext>
+                      </a:extLst>
+                    </a:blip>
+                    <a:srcRect l="17199" t="29745" r="15322" b="35292"/>
+                    <a:stretch>
+                      <a:fillRect/>
+                    </a:stretch>
+                  </pic:blipFill>
+                  <pic:spPr bwMode="auto">
+                    <a:xfrm>
+                      <a:off x="0" y="0"/>
+                      <a:ext cx="5446422" cy="1978803"/>
+                    </a:xfrm>
+                    <a:prstGeom prst="rect">
+                      <a:avLst/>
+                    </a:prstGeom>
+                    <a:noFill/>
+                    <a:ln>
+                      <a:noFill/>
+                    </a:ln>
+                    <a:extLst>
+                      <a:ext uri="{53640926-AAD7-44D8-BBD7-CCE9431645EC}">
+                        <a14:shadowObscured xmlns:a14="http://schemas.microsoft.com/office/drawing/2010/main"/>
+                      </a:ext>
+                    </a:extLst>
+                  </pic:spPr>
+                </pic:pic>
+              </a:graphicData>
+            </a:graphic>
+          </wp:inline>
+        </w:drawing>
+      </w:r>
+    </w:p>
+    <w:p>
+      <w:pPr>
+        <w:rPr>
+          <w:lang w:val="de-AT"/>
+        </w:rPr>
+      </w:pPr>
+      <w:r>
+        <w:rPr>
+          <w:lang w:val="de-AT"/>
+        </w:rPr>
+        <w:t>Fehler die gemascht wurden war das RVS und REFIO verbunden wrde dies wurde im nachhinein behoden, denn RVS ist ein GP output und hat immer wenn eine messung möglich wäre REFIO auf gnd gezogen, der ADC wurde nicht beschädigt.</w:t>
+      </w:r>
+    </w:p>
+    <w:p>
+      <w:pPr>
+        <w:pStyle w:val="berschrift1"/>
+        <w:rPr>
+          <w:lang w:val="de-AT"/>
+        </w:rPr>
+      </w:pPr>
+      <w:bookmarkStart w:id="18" w:name="_Toc236315628"/>
+      <w:r>
+        <w:rPr>
+          <w:lang w:val="de-AT"/>
+        </w:rPr>
+        <w:t>OPVs</w:t>
+      </w:r>
+      <w:bookmarkEnd w:id="18"/>
+    </w:p>
+    <w:p>
+      <w:pPr>
+        <w:rPr>
+          <w:lang w:val="de-AT"/>
+        </w:rPr>
+      </w:pPr>
+      <w:r>
+        <w:rPr>
+          <w:lang w:val="de-AT"/>
+        </w:rPr>
+        <w:t xml:space="preserve">Die auswahl der opv ist sehr kritisch für die eingengsstufe den TIA muss ein OPV verwendet werden welcher einen geringen eingangsstrom hat, besstenfalls noch </w:t>
+      </w:r>
+      <w:r>
+        <w:rPr>
+          <w:lang w:val="de-AT"/>
+        </w:rPr>
+        <w:t xml:space="preserve">einen geringen Output offset doch dieser kann aus den messungen heraus gerechnet werden. </w:t>
+      </w:r>
+    </w:p>
+    <w:p>
+      <w:pPr>
+        <w:rPr>
+          <w:lang w:val="de-AT"/>
+        </w:rPr>
+      </w:pPr>
+      <w:r>
+        <w:rPr>
+          <w:lang w:val="de-AT"/>
+        </w:rPr>
+        <w:lastRenderedPageBreak/>
+        <w:t>Alerdings beötigen die OPV der Ausgangsstufe für GATE und DRAIN des MOSFET eine Geringe Ofset spannung da bei diesen das offset nicht nachgemessen wird und damit nicht herausgerechnet werden kann, anzudenken it eine digitale rückkopplung zumachen also den DAC ausgang mit enem ADC rückzumessen um die offset spannung rückzurechnen.</w:t>
+      </w:r>
+    </w:p>
+    <w:p>
+      <w:pPr>
+        <w:rPr>
+          <w:lang w:val="de-AT"/>
+        </w:rPr>
+      </w:pPr>
+      <w:r>
+        <w:rPr>
+          <w:lang w:val="de-AT"/>
+        </w:rPr>
+        <w:t>Nicht nur das rückführen des DAC signals könnte verwendet werden um das offset zu minimieren weiters aknn auch eine referenz wie im karpitel 5.1 verwendet werden zum abgleichen</w:t>
+      </w:r>
+      <w:r>
+        <w:rPr>
+          <w:lang w:val="de-AT"/>
+        </w:rPr>
+        <w:t>.</w:t>
+      </w:r>
+    </w:p>
+    <w:p>
+      <w:pPr>
+        <w:rPr>
+          <w:lang w:val="de-AT"/>
+        </w:rPr>
+      </w:pPr>
+    </w:p>
+    <w:p>
+      <w:pPr>
+        <w:rPr>
+          <w:lang w:val="de-AT"/>
+        </w:rPr>
+      </w:pPr>
+      <w:r>
+        <w:rPr>
+          <w:lang w:val="de-AT"/>
+        </w:rPr>
+        <w:t>Für den TIA eingsngsstufe weurde von der TU der LMC6001 empolen da dieser einen eingangsstrom bias von maximal 25fA</w:t>
+      </w:r>
+    </w:p>
+    <w:p>
+      <w:pPr>
+        <w:rPr>
+          <w:lang w:val="de-AT"/>
+        </w:rPr>
+      </w:pPr>
+      <w:r>
+        <w:rPr>
+          <w:lang w:val="de-AT"/>
+        </w:rPr>
+        <w:drawing>
+          <wp:inline distT="0" distB="0" distL="0" distR="0" wp14:anchorId="67784D94" wp14:editId="49B12B79">
+            <wp:extent cx="5759450" cy="4824730"/>
+            <wp:effectExtent l="0" t="0" r="0" b="0"/>
+            <wp:docPr id="378719109" name="Grafik 1"/>
+            <wp:cNvGraphicFramePr>
+              <a:graphicFrameLocks xmlns:a="http://schemas.openxmlformats.org/drawingml/2006/main" noChangeAspect="1"/>
+            </wp:cNvGraphicFramePr>
+            <a:graphic xmlns:a="http://schemas.openxmlformats.org/drawingml/2006/main">
+              <a:graphicData uri="http://schemas.openxmlformats.org/drawingml/2006/picture">
+                <pic:pic xmlns:pic="http://schemas.openxmlformats.org/drawingml/2006/picture">
+                  <pic:nvPicPr>
+                    <pic:cNvPr id="378719109" name=""/>
+                    <pic:cNvPicPr/>
+                  </pic:nvPicPr>
+                  <pic:blipFill>
+                    <a:blip r:embed="rId23"/>
+                    <a:stretch>
+                      <a:fillRect/>
+                    </a:stretch>
+                  </pic:blipFill>
+                  <pic:spPr>
+                    <a:xfrm>
+                      <a:off x="0" y="0"/>
+                      <a:ext cx="5759450" cy="4824730"/>
+                    </a:xfrm>
+                    <a:prstGeom prst="rect">
+                      <a:avLst/>
+                    </a:prstGeom>
+                  </pic:spPr>
+                </pic:pic>
+              </a:graphicData>
+            </a:graphic>
+          </wp:inline>
+        </w:drawing>
+      </w:r>
+    </w:p>
+    <w:p>
+      <w:pPr>
+        <w:rPr>
+          <w:lang w:val="de-AT"/>
+        </w:rPr>
+      </w:pPr>
+      <w:r>
+        <w:rPr>
+          <w:lang w:val="de-AT"/>
+        </w:rPr>
+        <w:t>Der Temperatur dirft hat auch auf dieses Bauteil große auswirkungen doch da selbst bei 125°C der Eingangsstrom bias um den faktor 10 kleiner ist als das kleinste messsignal.</w:t>
+      </w:r>
+    </w:p>
+    <w:p>
+      <w:pPr>
+        <w:rPr>
+          <w:lang w:val="de-AT"/>
+        </w:rPr>
+      </w:pPr>
+    </w:p>
+    <w:p>
+      <w:r>
+        <w:rPr>
+          <w:lang w:val="de-AT"/>
+        </w:rPr>
+        <w:t xml:space="preserve">Für die Buffer oder 2verstärkerstufen wird ein </w:t>
+      </w:r>
+      <w:r>
+        <w:t>OPA197</w:t>
+      </w:r>
+      <w:r>
+        <w:t xml:space="preserve"> verwendetda dieser ein </w:t>
+      </w:r>
+      <w:r>
+        <w:t>Einzelner 36-V-Präzisions-Operationsverstärker mit Rail-to-Rail-Eingang und Ausgang mit niedriger Offsetspannung</w:t>
+      </w:r>
+      <w:r>
+        <w:t xml:space="preserve"> ist.  </w:t>
+      </w:r>
+    </w:p>
+    <w:p>
+      <w:pPr>
+        <w:pStyle w:val="berschrift1"/>
+        <w:rPr>
+          <w:lang w:val="de-AT"/>
+        </w:rPr>
+      </w:pPr>
+      <w:r>
+        <w:rPr>
+          <w:lang w:val="de-AT"/>
+        </w:rPr>
+        <w:t>DAC</w:t>
+      </w:r>
+    </w:p>
+    <w:p>
+      <w:pPr>
+        <w:rPr>
+          <w:lang w:val="de-AT"/>
+        </w:rPr>
+      </w:pPr>
+      <w:r>
+        <w:rPr>
+          <w:lang w:val="de-AT"/>
+        </w:rPr>
+        <w:t xml:space="preserve">Um die spannungen GATE DRAIn für den MOSFET einzustellen, sl ein DAC verwendet werden um eine variable spanung einzustellen, entweder 2 DAC für jede spannung oder einen dac mit 2 channels. Es wurde die 2 variante gewählt. Ebenfalls wie bei ADC wurde ein 16bit DAC verwendet. Ein </w:t>
+      </w:r>
+      <w:r>
+        <w:rPr>
+          <w:lang w:val="de-AT"/>
+        </w:rPr>
+        <w:t>AD5689RBRUZ</w:t>
+      </w:r>
+      <w:r>
+        <w:rPr>
+          <w:lang w:val="de-AT"/>
+        </w:rPr>
+        <w:t>.</w:t>
+      </w:r>
+    </w:p>
+    <w:p>
+      <w:pPr>
+        <w:rPr>
+          <w:lang w:val="de-AT"/>
+        </w:rPr>
+      </w:pPr>
+    </w:p>
+    <w:p>
+      <w:pPr>
+        <w:pStyle w:val="berschrift2"/>
+        <w:rPr>
+          <w:lang w:val="de-AT"/>
+        </w:rPr>
+      </w:pPr>
+      <w:r>
+        <w:rPr>
+          <w:lang w:val="de-AT"/>
+        </w:rPr>
+        <w:lastRenderedPageBreak/>
+        <w:t>AD5689</w:t>
+      </w:r>
+      <w:r>
+        <w:rPr>
+          <w:lang w:val="de-AT"/>
+        </w:rPr>
+        <w:t xml:space="preserve"> Schaltung</w:t>
+      </w:r>
+    </w:p>
+    <w:p>
+      <w:pPr>
+        <w:rPr>
+          <w:lang w:val="de-AT"/>
+        </w:rPr>
+      </w:pPr>
+      <w:r>
+        <w:rPr>
+          <w:noProof/>
+          <w:lang w:val="de-AT"/>
+        </w:rPr>
+        <w:drawing>
+          <wp:inline distT="0" distB="0" distL="0" distR="0" wp14:anchorId="277E49DD" wp14:editId="2C82401D">
+            <wp:extent cx="5462709" cy="2012577"/>
+            <wp:effectExtent l="0" t="0" r="5080" b="6985"/>
+            <wp:docPr id="2140122599" name="Grafik 2"/>
+            <wp:cNvGraphicFramePr>
+              <a:graphicFrameLocks xmlns:a="http://schemas.openxmlformats.org/drawingml/2006/main" noChangeAspect="1"/>
+            </wp:cNvGraphicFramePr>
+            <a:graphic xmlns:a="http://schemas.openxmlformats.org/drawingml/2006/main">
+              <a:graphicData uri="http://schemas.openxmlformats.org/drawingml/2006/picture">
+                <pic:pic xmlns:pic="http://schemas.openxmlformats.org/drawingml/2006/picture">
+                  <pic:nvPicPr>
+                    <pic:cNvPr id="0" name="Picture 2"/>
+                    <pic:cNvPicPr>
+                      <a:picLocks noChangeAspect="1" noChangeArrowheads="1"/>
+                    </pic:cNvPicPr>
+                  </pic:nvPicPr>
+                  <pic:blipFill rotWithShape="1">
+                    <a:blip r:embed="rId24">
+                      <a:extLst>
+                        <a:ext uri="{28A0092B-C50C-407E-A947-70E740481C1C}">
+                          <a14:useLocalDpi xmlns:a14="http://schemas.microsoft.com/office/drawing/2010/main" val="0"/>
+                        </a:ext>
+                      </a:extLst>
+                    </a:blip>
+                    <a:srcRect l="23893" t="34406" r="25822" b="39174"/>
+                    <a:stretch>
+                      <a:fillRect/>
+                    </a:stretch>
+                  </pic:blipFill>
+                  <pic:spPr bwMode="auto">
+                    <a:xfrm>
+                      <a:off x="0" y="0"/>
+                      <a:ext cx="5490569" cy="2022841"/>
+                    </a:xfrm>
+                    <a:prstGeom prst="rect">
+                      <a:avLst/>
+                    </a:prstGeom>
+                    <a:noFill/>
+                    <a:ln>
+                      <a:noFill/>
+                    </a:ln>
+                    <a:extLst>
+                      <a:ext uri="{53640926-AAD7-44D8-BBD7-CCE9431645EC}">
+                        <a14:shadowObscured xmlns:a14="http://schemas.microsoft.com/office/drawing/2010/main"/>
+                      </a:ext>
+                    </a:extLst>
+                  </pic:spPr>
+                </pic:pic>
+              </a:graphicData>
+            </a:graphic>
+          </wp:inline>
+        </w:drawing>
+      </w:r>
+    </w:p>
+    <w:p>
+      <w:pPr>
+        <w:rPr>
+          <w:lang w:val="de-AT"/>
+        </w:rPr>
+      </w:pPr>
+      <w:r>
+        <w:rPr>
+          <w:lang w:val="de-AT"/>
+        </w:rPr>
+        <w:t>Bei AD5689 wird der gain eingang verwendet um zwischen einer 0-2.5V n einer 0-5V range unzuschalten.</w:t>
+      </w:r>
+    </w:p>
+    <w:p>
+      <w:pPr>
+        <w:pStyle w:val="berschrift1"/>
+      </w:pPr>
+      <w:bookmarkStart w:id="19" w:name="_Toc236315629"/>
+      <w:r>
         <w:t>Abschließende Bemerkungen</w:t>
       </w:r>
-      <w:bookmarkEnd w:id="0"/>
+      <w:bookmarkEnd w:id="19"/>
       <w:r>
         <w:t xml:space="preserve"> </w:t>
       </w:r>
@@ -4596,11 +6350,11 @@
       <w:pPr>
         <w:pStyle w:val="berschrift1"/>
       </w:pPr>
-      <w:bookmarkStart w:id="1" w:name="_Toc524250396"/>
+      <w:bookmarkStart w:id="20" w:name="_Toc236315630"/>
       <w:r>
         <w:t>Inventarliste</w:t>
       </w:r>
-      <w:bookmarkEnd w:id="1"/>
+      <w:bookmarkEnd w:id="20"/>
       <w:r>
         <w:t xml:space="preserve"> </w:t>
       </w:r>
@@ -4687,7 +6441,7 @@
 </file>
 
 <file path=word/endnotes.xml><?xml version="1.0" encoding="utf-8"?>
-<w:endnotes xmlns:wpc="http://schemas.microsoft.com/office/word/2010/wordprocessingCanvas" xmlns:cx="http://schemas.microsoft.com/office/drawing/2014/chartex" xmlns:cx1="http://schemas.microsoft.com/office/drawing/2015/9/8/chartex" xmlns:cx2="http://schemas.microsoft.com/office/drawing/2015/10/21/chartex" xmlns:cx3="http://schemas.microsoft.com/office/drawing/2016/5/9/chartex" xmlns:cx4="http://schemas.microsoft.com/office/drawing/2016/5/10/chartex" xmlns:cx5="http://schemas.microsoft.com/office/drawing/2016/5/11/chartex" xmlns:cx6="http://schemas.microsoft.com/office/drawing/2016/5/12/chartex" xmlns:cx7="http://schemas.microsoft.com/office/drawing/2016/5/13/chartex" xmlns:cx8="http://schemas.microsoft.com/office/drawing/2016/5/14/chartex" xmlns:mc="http://schemas.openxmlformats.org/markup-compatibility/2006" xmlns:aink="http://schemas.microsoft.com/office/drawing/2016/ink" xmlns:am3d="http://schemas.microsoft.com/office/drawing/2017/model3d" xmlns:o="urn:schemas-microsoft-com:office:office" xmlns:oel="http://schemas.microsoft.com/office/2019/extlst" xmlns:r="http://schemas.openxmlformats.org/officeDocument/2006/relationships" xmlns:m="http://schemas.openxmlformats.org/officeDocument/2006/math" xmlns:v="urn:schemas-microsoft-com:vml" xmlns:wp14="http://schemas.microsoft.com/office/word/2010/wordprocessingDrawing" xmlns:wp="http://schemas.openxmlformats.org/drawingml/2006/wordprocessingDrawing" xmlns:w10="urn:schemas-microsoft-com:office:word" xmlns:w="http://schemas.openxmlformats.org/wordprocessingml/2006/main" xmlns:w14="http://schemas.microsoft.com/office/word/2010/wordml" xmlns:w15="http://schemas.microsoft.com/office/word/2012/wordml" xmlns:w16cex="http://schemas.microsoft.com/office/word/2018/wordml/cex" xmlns:w16cid="http://schemas.microsoft.com/office/word/2016/wordml/cid" xmlns:w16="http://schemas.microsoft.com/office/word/2018/wordml" xmlns:w16du="http://schemas.microsoft.com/office/word/2023/wordml/word16du" xmlns:w16sdtdh="http://schemas.microsoft.com/office/word/2020/wordml/sdtdatahash" xmlns:w16sdtfl="http://schemas.microsoft.com/office/word/2024/wordml/sdtformatlock" xmlns:w16se="http://schemas.microsoft.com/office/word/2015/wordml/symex" xmlns:wpg="http://schemas.microsoft.com/office/word/2010/wordprocessingGroup" xmlns:wpi="http://schemas.microsoft.com/office/word/2010/wordprocessingInk" xmlns:wne="http://schemas.microsoft.com/office/word/2006/wordml" xmlns:wps="http://schemas.microsoft.com/office/word/2010/wordprocessingShape" mc:Ignorable="w14 w15 w16se w16cid w16 w16cex w16sdtdh w16sdtfl w16du wp14">
+<w:endnotes xmlns:wpc="http://schemas.microsoft.com/office/word/2010/wordprocessingCanvas" xmlns:cx="http://schemas.microsoft.com/office/drawing/2014/chartex" xmlns:cx1="http://schemas.microsoft.com/office/drawing/2015/9/8/chartex" xmlns:cx2="http://schemas.microsoft.com/office/drawing/2015/10/21/chartex" xmlns:cx3="http://schemas.microsoft.com/office/drawing/2016/5/9/chartex" xmlns:cx4="http://schemas.microsoft.com/office/drawing/2016/5/10/chartex" xmlns:cx5="http://schemas.microsoft.com/office/drawing/2016/5/11/chartex" xmlns:cx6="http://schemas.microsoft.com/office/drawing/2016/5/12/chartex" xmlns:cx7="http://schemas.microsoft.com/office/drawing/2016/5/13/chartex" xmlns:cx8="http://schemas.microsoft.com/office/drawing/2016/5/14/chartex" xmlns:mc="http://schemas.openxmlformats.org/markup-compatibility/2006" xmlns:aink="http://schemas.microsoft.com/office/drawing/2016/ink" xmlns:am3d="http://schemas.microsoft.com/office/drawing/2017/model3d" xmlns:o="urn:schemas-microsoft-com:office:office" xmlns:oel="http://schemas.microsoft.com/office/2019/extlst" xmlns:r="http://schemas.openxmlformats.org/officeDocument/2006/relationships" xmlns:m="http://schemas.openxmlformats.org/officeDocument/2006/math" xmlns:v="urn:schemas-microsoft-com:vml" xmlns:wp14="http://schemas.microsoft.com/office/word/2010/wordprocessingDrawing" xmlns:wp="http://schemas.openxmlformats.org/drawingml/2006/wordprocessingDrawing" xmlns:w10="urn:schemas-microsoft-com:office:word" xmlns:w="http://schemas.openxmlformats.org/wordprocessingml/2006/main" xmlns:w14="http://schemas.microsoft.com/office/word/2010/wordml" xmlns:w15="http://schemas.microsoft.com/office/word/2012/wordml" xmlns:w16cei="http://schemas.microsoft.com/office/word/2026/wordml/cei" xmlns:w16cex="http://schemas.microsoft.com/office/word/2018/wordml/cex" xmlns:w16cid="http://schemas.microsoft.com/office/word/2016/wordml/cid" xmlns:w16="http://schemas.microsoft.com/office/word/2018/wordml" xmlns:w16du="http://schemas.microsoft.com/office/word/2023/wordml/word16du" xmlns:w16sdtdh="http://schemas.microsoft.com/office/word/2020/wordml/sdtdatahash" xmlns:w16sdtfl="http://schemas.microsoft.com/office/word/2024/wordml/sdtformatlock" xmlns:w16se="http://schemas.microsoft.com/office/word/2015/wordml/symex" xmlns:wpg="http://schemas.microsoft.com/office/word/2010/wordprocessingGroup" xmlns:wpi="http://schemas.microsoft.com/office/word/2010/wordprocessingInk" xmlns:wne="http://schemas.microsoft.com/office/word/2006/wordml" xmlns:wps="http://schemas.microsoft.com/office/word/2010/wordprocessingShape" mc:Ignorable="w14 w15 w16se w16cid w16 w16cex w16sdtdh w16sdtfl w16du wp14">
   <w:endnote w:type="separator" w:id="-1">
     <w:p>
       <w:r>
@@ -4706,13 +6460,13 @@
 </file>
 
 <file path=word/footer1.xml><?xml version="1.0" encoding="utf-8"?>
-<w:ftr xmlns:wpc="http://schemas.microsoft.com/office/word/2010/wordprocessingCanvas" xmlns:cx="http://schemas.microsoft.com/office/drawing/2014/chartex" xmlns:cx1="http://schemas.microsoft.com/office/drawing/2015/9/8/chartex" xmlns:cx2="http://schemas.microsoft.com/office/drawing/2015/10/21/chartex" xmlns:cx3="http://schemas.microsoft.com/office/drawing/2016/5/9/chartex" xmlns:cx4="http://schemas.microsoft.com/office/drawing/2016/5/10/chartex" xmlns:cx5="http://schemas.microsoft.com/office/drawing/2016/5/11/chartex" xmlns:cx6="http://schemas.microsoft.com/office/drawing/2016/5/12/chartex" xmlns:cx7="http://schemas.microsoft.com/office/drawing/2016/5/13/chartex" xmlns:cx8="http://schemas.microsoft.com/office/drawing/2016/5/14/chartex" xmlns:mc="http://schemas.openxmlformats.org/markup-compatibility/2006" xmlns:aink="http://schemas.microsoft.com/office/drawing/2016/ink" xmlns:am3d="http://schemas.microsoft.com/office/drawing/2017/model3d" xmlns:o="urn:schemas-microsoft-com:office:office" xmlns:oel="http://schemas.microsoft.com/office/2019/extlst" xmlns:r="http://schemas.openxmlformats.org/officeDocument/2006/relationships" xmlns:m="http://schemas.openxmlformats.org/officeDocument/2006/math" xmlns:v="urn:schemas-microsoft-com:vml" xmlns:wp14="http://schemas.microsoft.com/office/word/2010/wordprocessingDrawing" xmlns:wp="http://schemas.openxmlformats.org/drawingml/2006/wordprocessingDrawing" xmlns:w10="urn:schemas-microsoft-com:office:word" xmlns:w="http://schemas.openxmlformats.org/wordprocessingml/2006/main" xmlns:w14="http://schemas.microsoft.com/office/word/2010/wordml" xmlns:w15="http://schemas.microsoft.com/office/word/2012/wordml" xmlns:w16cex="http://schemas.microsoft.com/office/word/2018/wordml/cex" xmlns:w16cid="http://schemas.microsoft.com/office/word/2016/wordml/cid" xmlns:w16="http://schemas.microsoft.com/office/word/2018/wordml" xmlns:w16du="http://schemas.microsoft.com/office/word/2023/wordml/word16du" xmlns:w16sdtdh="http://schemas.microsoft.com/office/word/2020/wordml/sdtdatahash" xmlns:w16sdtfl="http://schemas.microsoft.com/office/word/2024/wordml/sdtformatlock" xmlns:w16se="http://schemas.microsoft.com/office/word/2015/wordml/symex" xmlns:wpg="http://schemas.microsoft.com/office/word/2010/wordprocessingGroup" xmlns:wpi="http://schemas.microsoft.com/office/word/2010/wordprocessingInk" xmlns:wne="http://schemas.microsoft.com/office/word/2006/wordml" xmlns:wps="http://schemas.microsoft.com/office/word/2010/wordprocessingShape" mc:Ignorable="w14 w15 w16se w16cid w16 w16cex w16sdtdh w16sdtfl w16du wp14">
+<w:ftr xmlns:wpc="http://schemas.microsoft.com/office/word/2010/wordprocessingCanvas" xmlns:cx="http://schemas.microsoft.com/office/drawing/2014/chartex" xmlns:cx1="http://schemas.microsoft.com/office/drawing/2015/9/8/chartex" xmlns:cx2="http://schemas.microsoft.com/office/drawing/2015/10/21/chartex" xmlns:cx3="http://schemas.microsoft.com/office/drawing/2016/5/9/chartex" xmlns:cx4="http://schemas.microsoft.com/office/drawing/2016/5/10/chartex" xmlns:cx5="http://schemas.microsoft.com/office/drawing/2016/5/11/chartex" xmlns:cx6="http://schemas.microsoft.com/office/drawing/2016/5/12/chartex" xmlns:cx7="http://schemas.microsoft.com/office/drawing/2016/5/13/chartex" xmlns:cx8="http://schemas.microsoft.com/office/drawing/2016/5/14/chartex" xmlns:mc="http://schemas.openxmlformats.org/markup-compatibility/2006" xmlns:aink="http://schemas.microsoft.com/office/drawing/2016/ink" xmlns:am3d="http://schemas.microsoft.com/office/drawing/2017/model3d" xmlns:o="urn:schemas-microsoft-com:office:office" xmlns:oel="http://schemas.microsoft.com/office/2019/extlst" xmlns:r="http://schemas.openxmlformats.org/officeDocument/2006/relationships" xmlns:m="http://schemas.openxmlformats.org/officeDocument/2006/math" xmlns:v="urn:schemas-microsoft-com:vml" xmlns:wp14="http://schemas.microsoft.com/office/word/2010/wordprocessingDrawing" xmlns:wp="http://schemas.openxmlformats.org/drawingml/2006/wordprocessingDrawing" xmlns:w10="urn:schemas-microsoft-com:office:word" xmlns:w="http://schemas.openxmlformats.org/wordprocessingml/2006/main" xmlns:w14="http://schemas.microsoft.com/office/word/2010/wordml" xmlns:w15="http://schemas.microsoft.com/office/word/2012/wordml" xmlns:w16cei="http://schemas.microsoft.com/office/word/2026/wordml/cei" xmlns:w16cex="http://schemas.microsoft.com/office/word/2018/wordml/cex" xmlns:w16cid="http://schemas.microsoft.com/office/word/2016/wordml/cid" xmlns:w16="http://schemas.microsoft.com/office/word/2018/wordml" xmlns:w16du="http://schemas.microsoft.com/office/word/2023/wordml/word16du" xmlns:w16sdtdh="http://schemas.microsoft.com/office/word/2020/wordml/sdtdatahash" xmlns:w16sdtfl="http://schemas.microsoft.com/office/word/2024/wordml/sdtformatlock" xmlns:w16se="http://schemas.microsoft.com/office/word/2015/wordml/symex" xmlns:wpg="http://schemas.microsoft.com/office/word/2010/wordprocessingGroup" xmlns:wpi="http://schemas.microsoft.com/office/word/2010/wordprocessingInk" xmlns:wne="http://schemas.microsoft.com/office/word/2006/wordml" xmlns:wps="http://schemas.microsoft.com/office/word/2010/wordprocessingShape" mc:Ignorable="w14 w15 w16se w16cid w16 w16cex w16sdtdh w16sdtfl w16du wp14">
   <w:p/>
 </w:ftr>
 </file>
 
 <file path=word/footer2.xml><?xml version="1.0" encoding="utf-8"?>
-<w:ftr xmlns:wpc="http://schemas.microsoft.com/office/word/2010/wordprocessingCanvas" xmlns:cx="http://schemas.microsoft.com/office/drawing/2014/chartex" xmlns:cx1="http://schemas.microsoft.com/office/drawing/2015/9/8/chartex" xmlns:cx2="http://schemas.microsoft.com/office/drawing/2015/10/21/chartex" xmlns:cx3="http://schemas.microsoft.com/office/drawing/2016/5/9/chartex" xmlns:cx4="http://schemas.microsoft.com/office/drawing/2016/5/10/chartex" xmlns:cx5="http://schemas.microsoft.com/office/drawing/2016/5/11/chartex" xmlns:cx6="http://schemas.microsoft.com/office/drawing/2016/5/12/chartex" xmlns:cx7="http://schemas.microsoft.com/office/drawing/2016/5/13/chartex" xmlns:cx8="http://schemas.microsoft.com/office/drawing/2016/5/14/chartex" xmlns:mc="http://schemas.openxmlformats.org/markup-compatibility/2006" xmlns:aink="http://schemas.microsoft.com/office/drawing/2016/ink" xmlns:am3d="http://schemas.microsoft.com/office/drawing/2017/model3d" xmlns:o="urn:schemas-microsoft-com:office:office" xmlns:oel="http://schemas.microsoft.com/office/2019/extlst" xmlns:r="http://schemas.openxmlformats.org/officeDocument/2006/relationships" xmlns:m="http://schemas.openxmlformats.org/officeDocument/2006/math" xmlns:v="urn:schemas-microsoft-com:vml" xmlns:wp14="http://schemas.microsoft.com/office/word/2010/wordprocessingDrawing" xmlns:wp="http://schemas.openxmlformats.org/drawingml/2006/wordprocessingDrawing" xmlns:w10="urn:schemas-microsoft-com:office:word" xmlns:w="http://schemas.openxmlformats.org/wordprocessingml/2006/main" xmlns:w14="http://schemas.microsoft.com/office/word/2010/wordml" xmlns:w15="http://schemas.microsoft.com/office/word/2012/wordml" xmlns:w16cex="http://schemas.microsoft.com/office/word/2018/wordml/cex" xmlns:w16cid="http://schemas.microsoft.com/office/word/2016/wordml/cid" xmlns:w16="http://schemas.microsoft.com/office/word/2018/wordml" xmlns:w16du="http://schemas.microsoft.com/office/word/2023/wordml/word16du" xmlns:w16sdtdh="http://schemas.microsoft.com/office/word/2020/wordml/sdtdatahash" xmlns:w16sdtfl="http://schemas.microsoft.com/office/word/2024/wordml/sdtformatlock" xmlns:w16se="http://schemas.microsoft.com/office/word/2015/wordml/symex" xmlns:wpg="http://schemas.microsoft.com/office/word/2010/wordprocessingGroup" xmlns:wpi="http://schemas.microsoft.com/office/word/2010/wordprocessingInk" xmlns:wne="http://schemas.microsoft.com/office/word/2006/wordml" xmlns:wps="http://schemas.microsoft.com/office/word/2010/wordprocessingShape" mc:Ignorable="w14 w15 w16se w16cid w16 w16cex w16sdtdh w16sdtfl w16du wp14">
+<w:ftr xmlns:wpc="http://schemas.microsoft.com/office/word/2010/wordprocessingCanvas" xmlns:cx="http://schemas.microsoft.com/office/drawing/2014/chartex" xmlns:cx1="http://schemas.microsoft.com/office/drawing/2015/9/8/chartex" xmlns:cx2="http://schemas.microsoft.com/office/drawing/2015/10/21/chartex" xmlns:cx3="http://schemas.microsoft.com/office/drawing/2016/5/9/chartex" xmlns:cx4="http://schemas.microsoft.com/office/drawing/2016/5/10/chartex" xmlns:cx5="http://schemas.microsoft.com/office/drawing/2016/5/11/chartex" xmlns:cx6="http://schemas.microsoft.com/office/drawing/2016/5/12/chartex" xmlns:cx7="http://schemas.microsoft.com/office/drawing/2016/5/13/chartex" xmlns:cx8="http://schemas.microsoft.com/office/drawing/2016/5/14/chartex" xmlns:mc="http://schemas.openxmlformats.org/markup-compatibility/2006" xmlns:aink="http://schemas.microsoft.com/office/drawing/2016/ink" xmlns:am3d="http://schemas.microsoft.com/office/drawing/2017/model3d" xmlns:o="urn:schemas-microsoft-com:office:office" xmlns:oel="http://schemas.microsoft.com/office/2019/extlst" xmlns:r="http://schemas.openxmlformats.org/officeDocument/2006/relationships" xmlns:m="http://schemas.openxmlformats.org/officeDocument/2006/math" xmlns:v="urn:schemas-microsoft-com:vml" xmlns:wp14="http://schemas.microsoft.com/office/word/2010/wordprocessingDrawing" xmlns:wp="http://schemas.openxmlformats.org/drawingml/2006/wordprocessingDrawing" xmlns:w10="urn:schemas-microsoft-com:office:word" xmlns:w="http://schemas.openxmlformats.org/wordprocessingml/2006/main" xmlns:w14="http://schemas.microsoft.com/office/word/2010/wordml" xmlns:w15="http://schemas.microsoft.com/office/word/2012/wordml" xmlns:w16cei="http://schemas.microsoft.com/office/word/2026/wordml/cei" xmlns:w16cex="http://schemas.microsoft.com/office/word/2018/wordml/cex" xmlns:w16cid="http://schemas.microsoft.com/office/word/2016/wordml/cid" xmlns:w16="http://schemas.microsoft.com/office/word/2018/wordml" xmlns:w16du="http://schemas.microsoft.com/office/word/2023/wordml/word16du" xmlns:w16sdtdh="http://schemas.microsoft.com/office/word/2020/wordml/sdtdatahash" xmlns:w16sdtfl="http://schemas.microsoft.com/office/word/2024/wordml/sdtformatlock" xmlns:w16se="http://schemas.microsoft.com/office/word/2015/wordml/symex" xmlns:wpg="http://schemas.microsoft.com/office/word/2010/wordprocessingGroup" xmlns:wpi="http://schemas.microsoft.com/office/word/2010/wordprocessingInk" xmlns:wne="http://schemas.microsoft.com/office/word/2006/wordml" xmlns:wps="http://schemas.microsoft.com/office/word/2010/wordprocessingShape" mc:Ignorable="w14 w15 w16se w16cid w16 w16cex w16sdtdh w16sdtfl w16du wp14">
   <w:tbl>
     <w:tblPr>
       <w:tblW w:w="0" w:type="auto"/>
@@ -4893,13 +6647,13 @@
 </file>
 
 <file path=word/footer3.xml><?xml version="1.0" encoding="utf-8"?>
-<w:ftr xmlns:wpc="http://schemas.microsoft.com/office/word/2010/wordprocessingCanvas" xmlns:cx="http://schemas.microsoft.com/office/drawing/2014/chartex" xmlns:cx1="http://schemas.microsoft.com/office/drawing/2015/9/8/chartex" xmlns:cx2="http://schemas.microsoft.com/office/drawing/2015/10/21/chartex" xmlns:cx3="http://schemas.microsoft.com/office/drawing/2016/5/9/chartex" xmlns:cx4="http://schemas.microsoft.com/office/drawing/2016/5/10/chartex" xmlns:cx5="http://schemas.microsoft.com/office/drawing/2016/5/11/chartex" xmlns:cx6="http://schemas.microsoft.com/office/drawing/2016/5/12/chartex" xmlns:cx7="http://schemas.microsoft.com/office/drawing/2016/5/13/chartex" xmlns:cx8="http://schemas.microsoft.com/office/drawing/2016/5/14/chartex" xmlns:mc="http://schemas.openxmlformats.org/markup-compatibility/2006" xmlns:aink="http://schemas.microsoft.com/office/drawing/2016/ink" xmlns:am3d="http://schemas.microsoft.com/office/drawing/2017/model3d" xmlns:o="urn:schemas-microsoft-com:office:office" xmlns:oel="http://schemas.microsoft.com/office/2019/extlst" xmlns:r="http://schemas.openxmlformats.org/officeDocument/2006/relationships" xmlns:m="http://schemas.openxmlformats.org/officeDocument/2006/math" xmlns:v="urn:schemas-microsoft-com:vml" xmlns:wp14="http://schemas.microsoft.com/office/word/2010/wordprocessingDrawing" xmlns:wp="http://schemas.openxmlformats.org/drawingml/2006/wordprocessingDrawing" xmlns:w10="urn:schemas-microsoft-com:office:word" xmlns:w="http://schemas.openxmlformats.org/wordprocessingml/2006/main" xmlns:w14="http://schemas.microsoft.com/office/word/2010/wordml" xmlns:w15="http://schemas.microsoft.com/office/word/2012/wordml" xmlns:w16cex="http://schemas.microsoft.com/office/word/2018/wordml/cex" xmlns:w16cid="http://schemas.microsoft.com/office/word/2016/wordml/cid" xmlns:w16="http://schemas.microsoft.com/office/word/2018/wordml" xmlns:w16du="http://schemas.microsoft.com/office/word/2023/wordml/word16du" xmlns:w16sdtdh="http://schemas.microsoft.com/office/word/2020/wordml/sdtdatahash" xmlns:w16sdtfl="http://schemas.microsoft.com/office/word/2024/wordml/sdtformatlock" xmlns:w16se="http://schemas.microsoft.com/office/word/2015/wordml/symex" xmlns:wpg="http://schemas.microsoft.com/office/word/2010/wordprocessingGroup" xmlns:wpi="http://schemas.microsoft.com/office/word/2010/wordprocessingInk" xmlns:wne="http://schemas.microsoft.com/office/word/2006/wordml" xmlns:wps="http://schemas.microsoft.com/office/word/2010/wordprocessingShape" mc:Ignorable="w14 w15 w16se w16cid w16 w16cex w16sdtdh w16sdtfl w16du wp14">
+<w:ftr xmlns:wpc="http://schemas.microsoft.com/office/word/2010/wordprocessingCanvas" xmlns:cx="http://schemas.microsoft.com/office/drawing/2014/chartex" xmlns:cx1="http://schemas.microsoft.com/office/drawing/2015/9/8/chartex" xmlns:cx2="http://schemas.microsoft.com/office/drawing/2015/10/21/chartex" xmlns:cx3="http://schemas.microsoft.com/office/drawing/2016/5/9/chartex" xmlns:cx4="http://schemas.microsoft.com/office/drawing/2016/5/10/chartex" xmlns:cx5="http://schemas.microsoft.com/office/drawing/2016/5/11/chartex" xmlns:cx6="http://schemas.microsoft.com/office/drawing/2016/5/12/chartex" xmlns:cx7="http://schemas.microsoft.com/office/drawing/2016/5/13/chartex" xmlns:cx8="http://schemas.microsoft.com/office/drawing/2016/5/14/chartex" xmlns:mc="http://schemas.openxmlformats.org/markup-compatibility/2006" xmlns:aink="http://schemas.microsoft.com/office/drawing/2016/ink" xmlns:am3d="http://schemas.microsoft.com/office/drawing/2017/model3d" xmlns:o="urn:schemas-microsoft-com:office:office" xmlns:oel="http://schemas.microsoft.com/office/2019/extlst" xmlns:r="http://schemas.openxmlformats.org/officeDocument/2006/relationships" xmlns:m="http://schemas.openxmlformats.org/officeDocument/2006/math" xmlns:v="urn:schemas-microsoft-com:vml" xmlns:wp14="http://schemas.microsoft.com/office/word/2010/wordprocessingDrawing" xmlns:wp="http://schemas.openxmlformats.org/drawingml/2006/wordprocessingDrawing" xmlns:w10="urn:schemas-microsoft-com:office:word" xmlns:w="http://schemas.openxmlformats.org/wordprocessingml/2006/main" xmlns:w14="http://schemas.microsoft.com/office/word/2010/wordml" xmlns:w15="http://schemas.microsoft.com/office/word/2012/wordml" xmlns:w16cei="http://schemas.microsoft.com/office/word/2026/wordml/cei" xmlns:w16cex="http://schemas.microsoft.com/office/word/2018/wordml/cex" xmlns:w16cid="http://schemas.microsoft.com/office/word/2016/wordml/cid" xmlns:w16="http://schemas.microsoft.com/office/word/2018/wordml" xmlns:w16du="http://schemas.microsoft.com/office/word/2023/wordml/word16du" xmlns:w16sdtdh="http://schemas.microsoft.com/office/word/2020/wordml/sdtdatahash" xmlns:w16sdtfl="http://schemas.microsoft.com/office/word/2024/wordml/sdtformatlock" xmlns:w16se="http://schemas.microsoft.com/office/word/2015/wordml/symex" xmlns:wpg="http://schemas.microsoft.com/office/word/2010/wordprocessingGroup" xmlns:wpi="http://schemas.microsoft.com/office/word/2010/wordprocessingInk" xmlns:wne="http://schemas.microsoft.com/office/word/2006/wordml" xmlns:wps="http://schemas.microsoft.com/office/word/2010/wordprocessingShape" mc:Ignorable="w14 w15 w16se w16cid w16 w16cex w16sdtdh w16sdtfl w16du wp14">
   <w:p/>
 </w:ftr>
 </file>
 
 <file path=word/footnotes.xml><?xml version="1.0" encoding="utf-8"?>
-<w:footnotes xmlns:wpc="http://schemas.microsoft.com/office/word/2010/wordprocessingCanvas" xmlns:cx="http://schemas.microsoft.com/office/drawing/2014/chartex" xmlns:cx1="http://schemas.microsoft.com/office/drawing/2015/9/8/chartex" xmlns:cx2="http://schemas.microsoft.com/office/drawing/2015/10/21/chartex" xmlns:cx3="http://schemas.microsoft.com/office/drawing/2016/5/9/chartex" xmlns:cx4="http://schemas.microsoft.com/office/drawing/2016/5/10/chartex" xmlns:cx5="http://schemas.microsoft.com/office/drawing/2016/5/11/chartex" xmlns:cx6="http://schemas.microsoft.com/office/drawing/2016/5/12/chartex" xmlns:cx7="http://schemas.microsoft.com/office/drawing/2016/5/13/chartex" xmlns:cx8="http://schemas.microsoft.com/office/drawing/2016/5/14/chartex" xmlns:mc="http://schemas.openxmlformats.org/markup-compatibility/2006" xmlns:aink="http://schemas.microsoft.com/office/drawing/2016/ink" xmlns:am3d="http://schemas.microsoft.com/office/drawing/2017/model3d" xmlns:o="urn:schemas-microsoft-com:office:office" xmlns:oel="http://schemas.microsoft.com/office/2019/extlst" xmlns:r="http://schemas.openxmlformats.org/officeDocument/2006/relationships" xmlns:m="http://schemas.openxmlformats.org/officeDocument/2006/math" xmlns:v="urn:schemas-microsoft-com:vml" xmlns:wp14="http://schemas.microsoft.com/office/word/2010/wordprocessingDrawing" xmlns:wp="http://schemas.openxmlformats.org/drawingml/2006/wordprocessingDrawing" xmlns:w10="urn:schemas-microsoft-com:office:word" xmlns:w="http://schemas.openxmlformats.org/wordprocessingml/2006/main" xmlns:w14="http://schemas.microsoft.com/office/word/2010/wordml" xmlns:w15="http://schemas.microsoft.com/office/word/2012/wordml" xmlns:w16cex="http://schemas.microsoft.com/office/word/2018/wordml/cex" xmlns:w16cid="http://schemas.microsoft.com/office/word/2016/wordml/cid" xmlns:w16="http://schemas.microsoft.com/office/word/2018/wordml" xmlns:w16du="http://schemas.microsoft.com/office/word/2023/wordml/word16du" xmlns:w16sdtdh="http://schemas.microsoft.com/office/word/2020/wordml/sdtdatahash" xmlns:w16sdtfl="http://schemas.microsoft.com/office/word/2024/wordml/sdtformatlock" xmlns:w16se="http://schemas.microsoft.com/office/word/2015/wordml/symex" xmlns:wpg="http://schemas.microsoft.com/office/word/2010/wordprocessingGroup" xmlns:wpi="http://schemas.microsoft.com/office/word/2010/wordprocessingInk" xmlns:wne="http://schemas.microsoft.com/office/word/2006/wordml" xmlns:wps="http://schemas.microsoft.com/office/word/2010/wordprocessingShape" mc:Ignorable="w14 w15 w16se w16cid w16 w16cex w16sdtdh w16sdtfl w16du wp14">
+<w:footnotes xmlns:wpc="http://schemas.microsoft.com/office/word/2010/wordprocessingCanvas" xmlns:cx="http://schemas.microsoft.com/office/drawing/2014/chartex" xmlns:cx1="http://schemas.microsoft.com/office/drawing/2015/9/8/chartex" xmlns:cx2="http://schemas.microsoft.com/office/drawing/2015/10/21/chartex" xmlns:cx3="http://schemas.microsoft.com/office/drawing/2016/5/9/chartex" xmlns:cx4="http://schemas.microsoft.com/office/drawing/2016/5/10/chartex" xmlns:cx5="http://schemas.microsoft.com/office/drawing/2016/5/11/chartex" xmlns:cx6="http://schemas.microsoft.com/office/drawing/2016/5/12/chartex" xmlns:cx7="http://schemas.microsoft.com/office/drawing/2016/5/13/chartex" xmlns:cx8="http://schemas.microsoft.com/office/drawing/2016/5/14/chartex" xmlns:mc="http://schemas.openxmlformats.org/markup-compatibility/2006" xmlns:aink="http://schemas.microsoft.com/office/drawing/2016/ink" xmlns:am3d="http://schemas.microsoft.com/office/drawing/2017/model3d" xmlns:o="urn:schemas-microsoft-com:office:office" xmlns:oel="http://schemas.microsoft.com/office/2019/extlst" xmlns:r="http://schemas.openxmlformats.org/officeDocument/2006/relationships" xmlns:m="http://schemas.openxmlformats.org/officeDocument/2006/math" xmlns:v="urn:schemas-microsoft-com:vml" xmlns:wp14="http://schemas.microsoft.com/office/word/2010/wordprocessingDrawing" xmlns:wp="http://schemas.openxmlformats.org/drawingml/2006/wordprocessingDrawing" xmlns:w10="urn:schemas-microsoft-com:office:word" xmlns:w="http://schemas.openxmlformats.org/wordprocessingml/2006/main" xmlns:w14="http://schemas.microsoft.com/office/word/2010/wordml" xmlns:w15="http://schemas.microsoft.com/office/word/2012/wordml" xmlns:w16cei="http://schemas.microsoft.com/office/word/2026/wordml/cei" xmlns:w16cex="http://schemas.microsoft.com/office/word/2018/wordml/cex" xmlns:w16cid="http://schemas.microsoft.com/office/word/2016/wordml/cid" xmlns:w16="http://schemas.microsoft.com/office/word/2018/wordml" xmlns:w16du="http://schemas.microsoft.com/office/word/2023/wordml/word16du" xmlns:w16sdtdh="http://schemas.microsoft.com/office/word/2020/wordml/sdtdatahash" xmlns:w16sdtfl="http://schemas.microsoft.com/office/word/2024/wordml/sdtformatlock" xmlns:w16se="http://schemas.microsoft.com/office/word/2015/wordml/symex" xmlns:wpg="http://schemas.microsoft.com/office/word/2010/wordprocessingGroup" xmlns:wpi="http://schemas.microsoft.com/office/word/2010/wordprocessingInk" xmlns:wne="http://schemas.microsoft.com/office/word/2006/wordml" xmlns:wps="http://schemas.microsoft.com/office/word/2010/wordprocessingShape" mc:Ignorable="w14 w15 w16se w16cid w16 w16cex w16sdtdh w16sdtfl w16du wp14">
   <w:footnote w:type="separator" w:id="-1">
     <w:p>
       <w:r>
@@ -4918,7 +6672,7 @@
 </file>
 
 <file path=word/header1.xml><?xml version="1.0" encoding="utf-8"?>
-<w:hdr xmlns:wpc="http://schemas.microsoft.com/office/word/2010/wordprocessingCanvas" xmlns:cx="http://schemas.microsoft.com/office/drawing/2014/chartex" xmlns:cx1="http://schemas.microsoft.com/office/drawing/2015/9/8/chartex" xmlns:cx2="http://schemas.microsoft.com/office/drawing/2015/10/21/chartex" xmlns:cx3="http://schemas.microsoft.com/office/drawing/2016/5/9/chartex" xmlns:cx4="http://schemas.microsoft.com/office/drawing/2016/5/10/chartex" xmlns:cx5="http://schemas.microsoft.com/office/drawing/2016/5/11/chartex" xmlns:cx6="http://schemas.microsoft.com/office/drawing/2016/5/12/chartex" xmlns:cx7="http://schemas.microsoft.com/office/drawing/2016/5/13/chartex" xmlns:cx8="http://schemas.microsoft.com/office/drawing/2016/5/14/chartex" xmlns:mc="http://schemas.openxmlformats.org/markup-compatibility/2006" xmlns:aink="http://schemas.microsoft.com/office/drawing/2016/ink" xmlns:am3d="http://schemas.microsoft.com/office/drawing/2017/model3d" xmlns:o="urn:schemas-microsoft-com:office:office" xmlns:oel="http://schemas.microsoft.com/office/2019/extlst" xmlns:r="http://schemas.openxmlformats.org/officeDocument/2006/relationships" xmlns:m="http://schemas.openxmlformats.org/officeDocument/2006/math" xmlns:v="urn:schemas-microsoft-com:vml" xmlns:wp14="http://schemas.microsoft.com/office/word/2010/wordprocessingDrawing" xmlns:wp="http://schemas.openxmlformats.org/drawingml/2006/wordprocessingDrawing" xmlns:w10="urn:schemas-microsoft-com:office:word" xmlns:w="http://schemas.openxmlformats.org/wordprocessingml/2006/main" xmlns:w14="http://schemas.microsoft.com/office/word/2010/wordml" xmlns:w15="http://schemas.microsoft.com/office/word/2012/wordml" xmlns:w16cex="http://schemas.microsoft.com/office/word/2018/wordml/cex" xmlns:w16cid="http://schemas.microsoft.com/office/word/2016/wordml/cid" xmlns:w16="http://schemas.microsoft.com/office/word/2018/wordml" xmlns:w16du="http://schemas.microsoft.com/office/word/2023/wordml/word16du" xmlns:w16sdtdh="http://schemas.microsoft.com/office/word/2020/wordml/sdtdatahash" xmlns:w16sdtfl="http://schemas.microsoft.com/office/word/2024/wordml/sdtformatlock" xmlns:w16se="http://schemas.microsoft.com/office/word/2015/wordml/symex" xmlns:wpg="http://schemas.microsoft.com/office/word/2010/wordprocessingGroup" xmlns:wpi="http://schemas.microsoft.com/office/word/2010/wordprocessingInk" xmlns:wne="http://schemas.microsoft.com/office/word/2006/wordml" xmlns:wps="http://schemas.microsoft.com/office/word/2010/wordprocessingShape" mc:Ignorable="w14 w15 w16se w16cid w16 w16cex w16sdtdh w16sdtfl w16du wp14">
+<w:hdr xmlns:wpc="http://schemas.microsoft.com/office/word/2010/wordprocessingCanvas" xmlns:cx="http://schemas.microsoft.com/office/drawing/2014/chartex" xmlns:cx1="http://schemas.microsoft.com/office/drawing/2015/9/8/chartex" xmlns:cx2="http://schemas.microsoft.com/office/drawing/2015/10/21/chartex" xmlns:cx3="http://schemas.microsoft.com/office/drawing/2016/5/9/chartex" xmlns:cx4="http://schemas.microsoft.com/office/drawing/2016/5/10/chartex" xmlns:cx5="http://schemas.microsoft.com/office/drawing/2016/5/11/chartex" xmlns:cx6="http://schemas.microsoft.com/office/drawing/2016/5/12/chartex" xmlns:cx7="http://schemas.microsoft.com/office/drawing/2016/5/13/chartex" xmlns:cx8="http://schemas.microsoft.com/office/drawing/2016/5/14/chartex" xmlns:mc="http://schemas.openxmlformats.org/markup-compatibility/2006" xmlns:aink="http://schemas.microsoft.com/office/drawing/2016/ink" xmlns:am3d="http://schemas.microsoft.com/office/drawing/2017/model3d" xmlns:o="urn:schemas-microsoft-com:office:office" xmlns:oel="http://schemas.microsoft.com/office/2019/extlst" xmlns:r="http://schemas.openxmlformats.org/officeDocument/2006/relationships" xmlns:m="http://schemas.openxmlformats.org/officeDocument/2006/math" xmlns:v="urn:schemas-microsoft-com:vml" xmlns:wp14="http://schemas.microsoft.com/office/word/2010/wordprocessingDrawing" xmlns:wp="http://schemas.openxmlformats.org/drawingml/2006/wordprocessingDrawing" xmlns:w10="urn:schemas-microsoft-com:office:word" xmlns:w="http://schemas.openxmlformats.org/wordprocessingml/2006/main" xmlns:w14="http://schemas.microsoft.com/office/word/2010/wordml" xmlns:w15="http://schemas.microsoft.com/office/word/2012/wordml" xmlns:w16cei="http://schemas.microsoft.com/office/word/2026/wordml/cei" xmlns:w16cex="http://schemas.microsoft.com/office/word/2018/wordml/cex" xmlns:w16cid="http://schemas.microsoft.com/office/word/2016/wordml/cid" xmlns:w16="http://schemas.microsoft.com/office/word/2018/wordml" xmlns:w16du="http://schemas.microsoft.com/office/word/2023/wordml/word16du" xmlns:w16sdtdh="http://schemas.microsoft.com/office/word/2020/wordml/sdtdatahash" xmlns:w16sdtfl="http://schemas.microsoft.com/office/word/2024/wordml/sdtformatlock" xmlns:w16se="http://schemas.microsoft.com/office/word/2015/wordml/symex" xmlns:wpg="http://schemas.microsoft.com/office/word/2010/wordprocessingGroup" xmlns:wpi="http://schemas.microsoft.com/office/word/2010/wordprocessingInk" xmlns:wne="http://schemas.microsoft.com/office/word/2006/wordml" xmlns:wps="http://schemas.microsoft.com/office/word/2010/wordprocessingShape" mc:Ignorable="w14 w15 w16se w16cid w16 w16cex w16sdtdh w16sdtfl w16du wp14">
   <w:p>
     <w:pPr>
       <w:pStyle w:val="Kopfzeile"/>
@@ -4992,13 +6746,13 @@
 </file>
 
 <file path=word/header2.xml><?xml version="1.0" encoding="utf-8"?>
-<w:hdr xmlns:wpc="http://schemas.microsoft.com/office/word/2010/wordprocessingCanvas" xmlns:cx="http://schemas.microsoft.com/office/drawing/2014/chartex" xmlns:cx1="http://schemas.microsoft.com/office/drawing/2015/9/8/chartex" xmlns:cx2="http://schemas.microsoft.com/office/drawing/2015/10/21/chartex" xmlns:cx3="http://schemas.microsoft.com/office/drawing/2016/5/9/chartex" xmlns:cx4="http://schemas.microsoft.com/office/drawing/2016/5/10/chartex" xmlns:cx5="http://schemas.microsoft.com/office/drawing/2016/5/11/chartex" xmlns:cx6="http://schemas.microsoft.com/office/drawing/2016/5/12/chartex" xmlns:cx7="http://schemas.microsoft.com/office/drawing/2016/5/13/chartex" xmlns:cx8="http://schemas.microsoft.com/office/drawing/2016/5/14/chartex" xmlns:mc="http://schemas.openxmlformats.org/markup-compatibility/2006" xmlns:aink="http://schemas.microsoft.com/office/drawing/2016/ink" xmlns:am3d="http://schemas.microsoft.com/office/drawing/2017/model3d" xmlns:o="urn:schemas-microsoft-com:office:office" xmlns:oel="http://schemas.microsoft.com/office/2019/extlst" xmlns:r="http://schemas.openxmlformats.org/officeDocument/2006/relationships" xmlns:m="http://schemas.openxmlformats.org/officeDocument/2006/math" xmlns:v="urn:schemas-microsoft-com:vml" xmlns:wp14="http://schemas.microsoft.com/office/word/2010/wordprocessingDrawing" xmlns:wp="http://schemas.openxmlformats.org/drawingml/2006/wordprocessingDrawing" xmlns:w10="urn:schemas-microsoft-com:office:word" xmlns:w="http://schemas.openxmlformats.org/wordprocessingml/2006/main" xmlns:w14="http://schemas.microsoft.com/office/word/2010/wordml" xmlns:w15="http://schemas.microsoft.com/office/word/2012/wordml" xmlns:w16cex="http://schemas.microsoft.com/office/word/2018/wordml/cex" xmlns:w16cid="http://schemas.microsoft.com/office/word/2016/wordml/cid" xmlns:w16="http://schemas.microsoft.com/office/word/2018/wordml" xmlns:w16du="http://schemas.microsoft.com/office/word/2023/wordml/word16du" xmlns:w16sdtdh="http://schemas.microsoft.com/office/word/2020/wordml/sdtdatahash" xmlns:w16sdtfl="http://schemas.microsoft.com/office/word/2024/wordml/sdtformatlock" xmlns:w16se="http://schemas.microsoft.com/office/word/2015/wordml/symex" xmlns:wpg="http://schemas.microsoft.com/office/word/2010/wordprocessingGroup" xmlns:wpi="http://schemas.microsoft.com/office/word/2010/wordprocessingInk" xmlns:wne="http://schemas.microsoft.com/office/word/2006/wordml" xmlns:wps="http://schemas.microsoft.com/office/word/2010/wordprocessingShape" mc:Ignorable="w14 w15 w16se w16cid w16 w16cex w16sdtdh w16sdtfl w16du wp14">
+<w:hdr xmlns:wpc="http://schemas.microsoft.com/office/word/2010/wordprocessingCanvas" xmlns:cx="http://schemas.microsoft.com/office/drawing/2014/chartex" xmlns:cx1="http://schemas.microsoft.com/office/drawing/2015/9/8/chartex" xmlns:cx2="http://schemas.microsoft.com/office/drawing/2015/10/21/chartex" xmlns:cx3="http://schemas.microsoft.com/office/drawing/2016/5/9/chartex" xmlns:cx4="http://schemas.microsoft.com/office/drawing/2016/5/10/chartex" xmlns:cx5="http://schemas.microsoft.com/office/drawing/2016/5/11/chartex" xmlns:cx6="http://schemas.microsoft.com/office/drawing/2016/5/12/chartex" xmlns:cx7="http://schemas.microsoft.com/office/drawing/2016/5/13/chartex" xmlns:cx8="http://schemas.microsoft.com/office/drawing/2016/5/14/chartex" xmlns:mc="http://schemas.openxmlformats.org/markup-compatibility/2006" xmlns:aink="http://schemas.microsoft.com/office/drawing/2016/ink" xmlns:am3d="http://schemas.microsoft.com/office/drawing/2017/model3d" xmlns:o="urn:schemas-microsoft-com:office:office" xmlns:oel="http://schemas.microsoft.com/office/2019/extlst" xmlns:r="http://schemas.openxmlformats.org/officeDocument/2006/relationships" xmlns:m="http://schemas.openxmlformats.org/officeDocument/2006/math" xmlns:v="urn:schemas-microsoft-com:vml" xmlns:wp14="http://schemas.microsoft.com/office/word/2010/wordprocessingDrawing" xmlns:wp="http://schemas.openxmlformats.org/drawingml/2006/wordprocessingDrawing" xmlns:w10="urn:schemas-microsoft-com:office:word" xmlns:w="http://schemas.openxmlformats.org/wordprocessingml/2006/main" xmlns:w14="http://schemas.microsoft.com/office/word/2010/wordml" xmlns:w15="http://schemas.microsoft.com/office/word/2012/wordml" xmlns:w16cei="http://schemas.microsoft.com/office/word/2026/wordml/cei" xmlns:w16cex="http://schemas.microsoft.com/office/word/2018/wordml/cex" xmlns:w16cid="http://schemas.microsoft.com/office/word/2016/wordml/cid" xmlns:w16="http://schemas.microsoft.com/office/word/2018/wordml" xmlns:w16du="http://schemas.microsoft.com/office/word/2023/wordml/word16du" xmlns:w16sdtdh="http://schemas.microsoft.com/office/word/2020/wordml/sdtdatahash" xmlns:w16sdtfl="http://schemas.microsoft.com/office/word/2024/wordml/sdtformatlock" xmlns:w16se="http://schemas.microsoft.com/office/word/2015/wordml/symex" xmlns:wpg="http://schemas.microsoft.com/office/word/2010/wordprocessingGroup" xmlns:wpi="http://schemas.microsoft.com/office/word/2010/wordprocessingInk" xmlns:wne="http://schemas.microsoft.com/office/word/2006/wordml" xmlns:wps="http://schemas.microsoft.com/office/word/2010/wordprocessingShape" mc:Ignorable="w14 w15 w16se w16cid w16 w16cex w16sdtdh w16sdtfl w16du wp14">
   <w:p/>
 </w:hdr>
 </file>
 
 <file path=word/header3.xml><?xml version="1.0" encoding="utf-8"?>
-<w:hdr xmlns:wpc="http://schemas.microsoft.com/office/word/2010/wordprocessingCanvas" xmlns:cx="http://schemas.microsoft.com/office/drawing/2014/chartex" xmlns:cx1="http://schemas.microsoft.com/office/drawing/2015/9/8/chartex" xmlns:cx2="http://schemas.microsoft.com/office/drawing/2015/10/21/chartex" xmlns:cx3="http://schemas.microsoft.com/office/drawing/2016/5/9/chartex" xmlns:cx4="http://schemas.microsoft.com/office/drawing/2016/5/10/chartex" xmlns:cx5="http://schemas.microsoft.com/office/drawing/2016/5/11/chartex" xmlns:cx6="http://schemas.microsoft.com/office/drawing/2016/5/12/chartex" xmlns:cx7="http://schemas.microsoft.com/office/drawing/2016/5/13/chartex" xmlns:cx8="http://schemas.microsoft.com/office/drawing/2016/5/14/chartex" xmlns:mc="http://schemas.openxmlformats.org/markup-compatibility/2006" xmlns:aink="http://schemas.microsoft.com/office/drawing/2016/ink" xmlns:am3d="http://schemas.microsoft.com/office/drawing/2017/model3d" xmlns:o="urn:schemas-microsoft-com:office:office" xmlns:oel="http://schemas.microsoft.com/office/2019/extlst" xmlns:r="http://schemas.openxmlformats.org/officeDocument/2006/relationships" xmlns:m="http://schemas.openxmlformats.org/officeDocument/2006/math" xmlns:v="urn:schemas-microsoft-com:vml" xmlns:wp14="http://schemas.microsoft.com/office/word/2010/wordprocessingDrawing" xmlns:wp="http://schemas.openxmlformats.org/drawingml/2006/wordprocessingDrawing" xmlns:w10="urn:schemas-microsoft-com:office:word" xmlns:w="http://schemas.openxmlformats.org/wordprocessingml/2006/main" xmlns:w14="http://schemas.microsoft.com/office/word/2010/wordml" xmlns:w15="http://schemas.microsoft.com/office/word/2012/wordml" xmlns:w16cex="http://schemas.microsoft.com/office/word/2018/wordml/cex" xmlns:w16cid="http://schemas.microsoft.com/office/word/2016/wordml/cid" xmlns:w16="http://schemas.microsoft.com/office/word/2018/wordml" xmlns:w16du="http://schemas.microsoft.com/office/word/2023/wordml/word16du" xmlns:w16sdtdh="http://schemas.microsoft.com/office/word/2020/wordml/sdtdatahash" xmlns:w16sdtfl="http://schemas.microsoft.com/office/word/2024/wordml/sdtformatlock" xmlns:w16se="http://schemas.microsoft.com/office/word/2015/wordml/symex" xmlns:wpg="http://schemas.microsoft.com/office/word/2010/wordprocessingGroup" xmlns:wpi="http://schemas.microsoft.com/office/word/2010/wordprocessingInk" xmlns:wne="http://schemas.microsoft.com/office/word/2006/wordml" xmlns:wps="http://schemas.microsoft.com/office/word/2010/wordprocessingShape" mc:Ignorable="w14 w15 w16se w16cid w16 w16cex w16sdtdh w16sdtfl w16du wp14">
+<w:hdr xmlns:wpc="http://schemas.microsoft.com/office/word/2010/wordprocessingCanvas" xmlns:cx="http://schemas.microsoft.com/office/drawing/2014/chartex" xmlns:cx1="http://schemas.microsoft.com/office/drawing/2015/9/8/chartex" xmlns:cx2="http://schemas.microsoft.com/office/drawing/2015/10/21/chartex" xmlns:cx3="http://schemas.microsoft.com/office/drawing/2016/5/9/chartex" xmlns:cx4="http://schemas.microsoft.com/office/drawing/2016/5/10/chartex" xmlns:cx5="http://schemas.microsoft.com/office/drawing/2016/5/11/chartex" xmlns:cx6="http://schemas.microsoft.com/office/drawing/2016/5/12/chartex" xmlns:cx7="http://schemas.microsoft.com/office/drawing/2016/5/13/chartex" xmlns:cx8="http://schemas.microsoft.com/office/drawing/2016/5/14/chartex" xmlns:mc="http://schemas.openxmlformats.org/markup-compatibility/2006" xmlns:aink="http://schemas.microsoft.com/office/drawing/2016/ink" xmlns:am3d="http://schemas.microsoft.com/office/drawing/2017/model3d" xmlns:o="urn:schemas-microsoft-com:office:office" xmlns:oel="http://schemas.microsoft.com/office/2019/extlst" xmlns:r="http://schemas.openxmlformats.org/officeDocument/2006/relationships" xmlns:m="http://schemas.openxmlformats.org/officeDocument/2006/math" xmlns:v="urn:schemas-microsoft-com:vml" xmlns:wp14="http://schemas.microsoft.com/office/word/2010/wordprocessingDrawing" xmlns:wp="http://schemas.openxmlformats.org/drawingml/2006/wordprocessingDrawing" xmlns:w10="urn:schemas-microsoft-com:office:word" xmlns:w="http://schemas.openxmlformats.org/wordprocessingml/2006/main" xmlns:w14="http://schemas.microsoft.com/office/word/2010/wordml" xmlns:w15="http://schemas.microsoft.com/office/word/2012/wordml" xmlns:w16cei="http://schemas.microsoft.com/office/word/2026/wordml/cei" xmlns:w16cex="http://schemas.microsoft.com/office/word/2018/wordml/cex" xmlns:w16cid="http://schemas.microsoft.com/office/word/2016/wordml/cid" xmlns:w16="http://schemas.microsoft.com/office/word/2018/wordml" xmlns:w16du="http://schemas.microsoft.com/office/word/2023/wordml/word16du" xmlns:w16sdtdh="http://schemas.microsoft.com/office/word/2020/wordml/sdtdatahash" xmlns:w16sdtfl="http://schemas.microsoft.com/office/word/2024/wordml/sdtformatlock" xmlns:w16se="http://schemas.microsoft.com/office/word/2015/wordml/symex" xmlns:wpg="http://schemas.microsoft.com/office/word/2010/wordprocessingGroup" xmlns:wpi="http://schemas.microsoft.com/office/word/2010/wordprocessingInk" xmlns:wne="http://schemas.microsoft.com/office/word/2006/wordml" xmlns:wps="http://schemas.microsoft.com/office/word/2010/wordprocessingShape" mc:Ignorable="w14 w15 w16se w16cid w16 w16cex w16sdtdh w16sdtfl w16du wp14">
   <w:p>
     <w:pPr>
       <w:pStyle w:val="Kopfzeile"/>
@@ -5044,13 +6798,13 @@
 </file>
 
 <file path=word/header4.xml><?xml version="1.0" encoding="utf-8"?>
-<w:hdr xmlns:wpc="http://schemas.microsoft.com/office/word/2010/wordprocessingCanvas" xmlns:cx="http://schemas.microsoft.com/office/drawing/2014/chartex" xmlns:cx1="http://schemas.microsoft.com/office/drawing/2015/9/8/chartex" xmlns:cx2="http://schemas.microsoft.com/office/drawing/2015/10/21/chartex" xmlns:cx3="http://schemas.microsoft.com/office/drawing/2016/5/9/chartex" xmlns:cx4="http://schemas.microsoft.com/office/drawing/2016/5/10/chartex" xmlns:cx5="http://schemas.microsoft.com/office/drawing/2016/5/11/chartex" xmlns:cx6="http://schemas.microsoft.com/office/drawing/2016/5/12/chartex" xmlns:cx7="http://schemas.microsoft.com/office/drawing/2016/5/13/chartex" xmlns:cx8="http://schemas.microsoft.com/office/drawing/2016/5/14/chartex" xmlns:mc="http://schemas.openxmlformats.org/markup-compatibility/2006" xmlns:aink="http://schemas.microsoft.com/office/drawing/2016/ink" xmlns:am3d="http://schemas.microsoft.com/office/drawing/2017/model3d" xmlns:o="urn:schemas-microsoft-com:office:office" xmlns:oel="http://schemas.microsoft.com/office/2019/extlst" xmlns:r="http://schemas.openxmlformats.org/officeDocument/2006/relationships" xmlns:m="http://schemas.openxmlformats.org/officeDocument/2006/math" xmlns:v="urn:schemas-microsoft-com:vml" xmlns:wp14="http://schemas.microsoft.com/office/word/2010/wordprocessingDrawing" xmlns:wp="http://schemas.openxmlformats.org/drawingml/2006/wordprocessingDrawing" xmlns:w10="urn:schemas-microsoft-com:office:word" xmlns:w="http://schemas.openxmlformats.org/wordprocessingml/2006/main" xmlns:w14="http://schemas.microsoft.com/office/word/2010/wordml" xmlns:w15="http://schemas.microsoft.com/office/word/2012/wordml" xmlns:w16cex="http://schemas.microsoft.com/office/word/2018/wordml/cex" xmlns:w16cid="http://schemas.microsoft.com/office/word/2016/wordml/cid" xmlns:w16="http://schemas.microsoft.com/office/word/2018/wordml" xmlns:w16du="http://schemas.microsoft.com/office/word/2023/wordml/word16du" xmlns:w16sdtdh="http://schemas.microsoft.com/office/word/2020/wordml/sdtdatahash" xmlns:w16sdtfl="http://schemas.microsoft.com/office/word/2024/wordml/sdtformatlock" xmlns:w16se="http://schemas.microsoft.com/office/word/2015/wordml/symex" xmlns:wpg="http://schemas.microsoft.com/office/word/2010/wordprocessingGroup" xmlns:wpi="http://schemas.microsoft.com/office/word/2010/wordprocessingInk" xmlns:wne="http://schemas.microsoft.com/office/word/2006/wordml" xmlns:wps="http://schemas.microsoft.com/office/word/2010/wordprocessingShape" mc:Ignorable="w14 w15 w16se w16cid w16 w16cex w16sdtdh w16sdtfl w16du wp14">
+<w:hdr xmlns:wpc="http://schemas.microsoft.com/office/word/2010/wordprocessingCanvas" xmlns:cx="http://schemas.microsoft.com/office/drawing/2014/chartex" xmlns:cx1="http://schemas.microsoft.com/office/drawing/2015/9/8/chartex" xmlns:cx2="http://schemas.microsoft.com/office/drawing/2015/10/21/chartex" xmlns:cx3="http://schemas.microsoft.com/office/drawing/2016/5/9/chartex" xmlns:cx4="http://schemas.microsoft.com/office/drawing/2016/5/10/chartex" xmlns:cx5="http://schemas.microsoft.com/office/drawing/2016/5/11/chartex" xmlns:cx6="http://schemas.microsoft.com/office/drawing/2016/5/12/chartex" xmlns:cx7="http://schemas.microsoft.com/office/drawing/2016/5/13/chartex" xmlns:cx8="http://schemas.microsoft.com/office/drawing/2016/5/14/chartex" xmlns:mc="http://schemas.openxmlformats.org/markup-compatibility/2006" xmlns:aink="http://schemas.microsoft.com/office/drawing/2016/ink" xmlns:am3d="http://schemas.microsoft.com/office/drawing/2017/model3d" xmlns:o="urn:schemas-microsoft-com:office:office" xmlns:oel="http://schemas.microsoft.com/office/2019/extlst" xmlns:r="http://schemas.openxmlformats.org/officeDocument/2006/relationships" xmlns:m="http://schemas.openxmlformats.org/officeDocument/2006/math" xmlns:v="urn:schemas-microsoft-com:vml" xmlns:wp14="http://schemas.microsoft.com/office/word/2010/wordprocessingDrawing" xmlns:wp="http://schemas.openxmlformats.org/drawingml/2006/wordprocessingDrawing" xmlns:w10="urn:schemas-microsoft-com:office:word" xmlns:w="http://schemas.openxmlformats.org/wordprocessingml/2006/main" xmlns:w14="http://schemas.microsoft.com/office/word/2010/wordml" xmlns:w15="http://schemas.microsoft.com/office/word/2012/wordml" xmlns:w16cei="http://schemas.microsoft.com/office/word/2026/wordml/cei" xmlns:w16cex="http://schemas.microsoft.com/office/word/2018/wordml/cex" xmlns:w16cid="http://schemas.microsoft.com/office/word/2016/wordml/cid" xmlns:w16="http://schemas.microsoft.com/office/word/2018/wordml" xmlns:w16du="http://schemas.microsoft.com/office/word/2023/wordml/word16du" xmlns:w16sdtdh="http://schemas.microsoft.com/office/word/2020/wordml/sdtdatahash" xmlns:w16sdtfl="http://schemas.microsoft.com/office/word/2024/wordml/sdtformatlock" xmlns:w16se="http://schemas.microsoft.com/office/word/2015/wordml/symex" xmlns:wpg="http://schemas.microsoft.com/office/word/2010/wordprocessingGroup" xmlns:wpi="http://schemas.microsoft.com/office/word/2010/wordprocessingInk" xmlns:wne="http://schemas.microsoft.com/office/word/2006/wordml" xmlns:wps="http://schemas.microsoft.com/office/word/2010/wordprocessingShape" mc:Ignorable="w14 w15 w16se w16cid w16 w16cex w16sdtdh w16sdtfl w16du wp14">
   <w:p/>
 </w:hdr>
 </file>
 
 <file path=word/numbering.xml><?xml version="1.0" encoding="utf-8"?>
-<w:numbering xmlns:wpc="http://schemas.microsoft.com/office/word/2010/wordprocessingCanvas" xmlns:cx="http://schemas.microsoft.com/office/drawing/2014/chartex" xmlns:cx1="http://schemas.microsoft.com/office/drawing/2015/9/8/chartex" xmlns:cx2="http://schemas.microsoft.com/office/drawing/2015/10/21/chartex" xmlns:cx3="http://schemas.microsoft.com/office/drawing/2016/5/9/chartex" xmlns:cx4="http://schemas.microsoft.com/office/drawing/2016/5/10/chartex" xmlns:cx5="http://schemas.microsoft.com/office/drawing/2016/5/11/chartex" xmlns:cx6="http://schemas.microsoft.com/office/drawing/2016/5/12/chartex" xmlns:cx7="http://schemas.microsoft.com/office/drawing/2016/5/13/chartex" xmlns:cx8="http://schemas.microsoft.com/office/drawing/2016/5/14/chartex" xmlns:mc="http://schemas.openxmlformats.org/markup-compatibility/2006" xmlns:aink="http://schemas.microsoft.com/office/drawing/2016/ink" xmlns:am3d="http://schemas.microsoft.com/office/drawing/2017/model3d" xmlns:o="urn:schemas-microsoft-com:office:office" xmlns:oel="http://schemas.microsoft.com/office/2019/extlst" xmlns:r="http://schemas.openxmlformats.org/officeDocument/2006/relationships" xmlns:m="http://schemas.openxmlformats.org/officeDocument/2006/math" xmlns:v="urn:schemas-microsoft-com:vml" xmlns:wp14="http://schemas.microsoft.com/office/word/2010/wordprocessingDrawing" xmlns:wp="http://schemas.openxmlformats.org/drawingml/2006/wordprocessingDrawing" xmlns:w10="urn:schemas-microsoft-com:office:word" xmlns:w="http://schemas.openxmlformats.org/wordprocessingml/2006/main" xmlns:w14="http://schemas.microsoft.com/office/word/2010/wordml" xmlns:w15="http://schemas.microsoft.com/office/word/2012/wordml" xmlns:w16cex="http://schemas.microsoft.com/office/word/2018/wordml/cex" xmlns:w16cid="http://schemas.microsoft.com/office/word/2016/wordml/cid" xmlns:w16="http://schemas.microsoft.com/office/word/2018/wordml" xmlns:w16du="http://schemas.microsoft.com/office/word/2023/wordml/word16du" xmlns:w16sdtdh="http://schemas.microsoft.com/office/word/2020/wordml/sdtdatahash" xmlns:w16sdtfl="http://schemas.microsoft.com/office/word/2024/wordml/sdtformatlock" xmlns:w16se="http://schemas.microsoft.com/office/word/2015/wordml/symex" xmlns:wpg="http://schemas.microsoft.com/office/word/2010/wordprocessingGroup" xmlns:wpi="http://schemas.microsoft.com/office/word/2010/wordprocessingInk" xmlns:wne="http://schemas.microsoft.com/office/word/2006/wordml" xmlns:wps="http://schemas.microsoft.com/office/word/2010/wordprocessingShape" mc:Ignorable="w14 w15 w16se w16cid w16 w16cex w16sdtdh w16sdtfl w16du wp14">
+<w:numbering xmlns:wpc="http://schemas.microsoft.com/office/word/2010/wordprocessingCanvas" xmlns:cx="http://schemas.microsoft.com/office/drawing/2014/chartex" xmlns:cx1="http://schemas.microsoft.com/office/drawing/2015/9/8/chartex" xmlns:cx2="http://schemas.microsoft.com/office/drawing/2015/10/21/chartex" xmlns:cx3="http://schemas.microsoft.com/office/drawing/2016/5/9/chartex" xmlns:cx4="http://schemas.microsoft.com/office/drawing/2016/5/10/chartex" xmlns:cx5="http://schemas.microsoft.com/office/drawing/2016/5/11/chartex" xmlns:cx6="http://schemas.microsoft.com/office/drawing/2016/5/12/chartex" xmlns:cx7="http://schemas.microsoft.com/office/drawing/2016/5/13/chartex" xmlns:cx8="http://schemas.microsoft.com/office/drawing/2016/5/14/chartex" xmlns:mc="http://schemas.openxmlformats.org/markup-compatibility/2006" xmlns:aink="http://schemas.microsoft.com/office/drawing/2016/ink" xmlns:am3d="http://schemas.microsoft.com/office/drawing/2017/model3d" xmlns:o="urn:schemas-microsoft-com:office:office" xmlns:oel="http://schemas.microsoft.com/office/2019/extlst" xmlns:r="http://schemas.openxmlformats.org/officeDocument/2006/relationships" xmlns:m="http://schemas.openxmlformats.org/officeDocument/2006/math" xmlns:v="urn:schemas-microsoft-com:vml" xmlns:wp14="http://schemas.microsoft.com/office/word/2010/wordprocessingDrawing" xmlns:wp="http://schemas.openxmlformats.org/drawingml/2006/wordprocessingDrawing" xmlns:w10="urn:schemas-microsoft-com:office:word" xmlns:w="http://schemas.openxmlformats.org/wordprocessingml/2006/main" xmlns:w14="http://schemas.microsoft.com/office/word/2010/wordml" xmlns:w15="http://schemas.microsoft.com/office/word/2012/wordml" xmlns:w16cei="http://schemas.microsoft.com/office/word/2026/wordml/cei" xmlns:w16cex="http://schemas.microsoft.com/office/word/2018/wordml/cex" xmlns:w16cid="http://schemas.microsoft.com/office/word/2016/wordml/cid" xmlns:w16="http://schemas.microsoft.com/office/word/2018/wordml" xmlns:w16du="http://schemas.microsoft.com/office/word/2023/wordml/word16du" xmlns:w16sdtdh="http://schemas.microsoft.com/office/word/2020/wordml/sdtdatahash" xmlns:w16sdtfl="http://schemas.microsoft.com/office/word/2024/wordml/sdtformatlock" xmlns:w16se="http://schemas.microsoft.com/office/word/2015/wordml/symex" xmlns:wpg="http://schemas.microsoft.com/office/word/2010/wordprocessingGroup" xmlns:wpi="http://schemas.microsoft.com/office/word/2010/wordprocessingInk" xmlns:wne="http://schemas.microsoft.com/office/word/2006/wordml" xmlns:wps="http://schemas.microsoft.com/office/word/2010/wordprocessingShape" mc:Ignorable="w14 w15 w16se w16cid w16 w16cex w16sdtdh w16sdtfl w16du wp14">
   <w:abstractNum w:abstractNumId="0" w15:restartNumberingAfterBreak="0">
     <w:nsid w:val="00000001"/>
     <w:multiLevelType w:val="multilevel"/>
@@ -5257,7 +7011,7 @@
     <w:lsdException w:name="index 9" w:semiHidden="1" w:unhideWhenUsed="1"/>
     <w:lsdException w:name="toc 1" w:semiHidden="1" w:uiPriority="39" w:unhideWhenUsed="1"/>
     <w:lsdException w:name="toc 2" w:semiHidden="1" w:uiPriority="39" w:unhideWhenUsed="1"/>
-    <w:lsdException w:name="toc 3" w:semiHidden="1" w:unhideWhenUsed="1"/>
+    <w:lsdException w:name="toc 3" w:semiHidden="1" w:uiPriority="39" w:unhideWhenUsed="1"/>
     <w:lsdException w:name="toc 4" w:semiHidden="1" w:unhideWhenUsed="1"/>
     <w:lsdException w:name="toc 5" w:semiHidden="1" w:unhideWhenUsed="1"/>
     <w:lsdException w:name="toc 6" w:semiHidden="1" w:unhideWhenUsed="1"/>
@@ -5783,7 +7537,6 @@
   <w:style w:type="character" w:default="1" w:styleId="Absatz-Standardschriftart">
     <w:name w:val="Default Paragraph Font"/>
     <w:uiPriority w:val="1"/>
-    <w:semiHidden/>
     <w:unhideWhenUsed/>
   </w:style>
   <w:style w:type="table" w:default="1" w:styleId="NormaleTabelle">
@@ -5965,6 +7718,7 @@
     <w:name w:val="toc 3"/>
     <w:basedOn w:val="Standard"/>
     <w:next w:val="Standard"/>
+    <w:uiPriority w:val="39"/>
     <w:pPr>
       <w:ind w:left="400"/>
     </w:pPr>

</xml_diff>